<commit_message>
docs: Modbus donanim raporunu guncelle
</commit_message>
<xml_diff>
--- a/Modbus Projesi Donanım Raporu.docx
+++ b/Modbus Projesi Donanım Raporu.docx
@@ -4,161 +4,44 @@
   <w:body>
     <w:p>
       <w:pPr>
-        <w:pStyle w:val="KonuBal"/>
-        <w:keepNext/>
-        <w:spacing w:after="120" w:line="260" w:lineRule="auto"/>
-        <w:jc w:val="center"/>
-      </w:pPr>
-      <w:proofErr w:type="spellStart"/>
-      <w:r>
-        <w:rPr>
-          <w:rFonts w:ascii="Garamond" w:hAnsi="Garamond" w:cs="Garamond"/>
-          <w:b/>
-          <w:color w:val="000000"/>
-          <w:sz w:val="44"/>
-          <w:lang w:val="tr-TR"/>
-        </w:rPr>
-        <w:t>Modbus</w:t>
-      </w:r>
-      <w:proofErr w:type="spellEnd"/>
-      <w:r>
-        <w:rPr>
-          <w:rFonts w:ascii="Garamond" w:hAnsi="Garamond" w:cs="Garamond"/>
-          <w:b/>
-          <w:color w:val="000000"/>
-          <w:sz w:val="44"/>
-          <w:lang w:val="tr-TR"/>
-        </w:rPr>
-        <w:t xml:space="preserve"> Projesi </w:t>
-      </w:r>
-      <w:r>
-        <w:rPr>
-          <w:rFonts w:ascii="Garamond" w:hAnsi="Garamond" w:cs="Garamond"/>
-          <w:b/>
-          <w:color w:val="000000"/>
-          <w:sz w:val="44"/>
-          <w:lang w:val="tr-TR"/>
-        </w:rPr>
-        <w:t>Donanım</w:t>
-      </w:r>
-      <w:bookmarkStart w:id="0" w:name="_GoBack"/>
-      <w:bookmarkEnd w:id="0"/>
-      <w:r>
-        <w:rPr>
-          <w:rFonts w:ascii="Garamond" w:hAnsi="Garamond" w:cs="Garamond"/>
-          <w:b/>
-          <w:color w:val="000000"/>
-          <w:sz w:val="44"/>
-          <w:lang w:val="tr-TR"/>
-        </w:rPr>
-        <w:t xml:space="preserve"> </w:t>
-      </w:r>
-      <w:proofErr w:type="spellStart"/>
-      <w:r>
-        <w:rPr>
-          <w:rFonts w:ascii="Garamond" w:hAnsi="Garamond" w:cs="Garamond"/>
-          <w:b/>
-          <w:color w:val="000000"/>
-          <w:sz w:val="44"/>
-          <w:lang w:val="tr-TR"/>
-        </w:rPr>
-        <w:t>Rapaoru</w:t>
-      </w:r>
-      <w:proofErr w:type="spellEnd"/>
-    </w:p>
-    <w:p>
-      <w:pPr>
         <w:pStyle w:val="Balk1"/>
         <w:spacing w:before="160" w:after="120" w:line="260" w:lineRule="auto"/>
         <w:jc w:val="center"/>
-      </w:pPr>
-      <w:r>
         <w:rPr>
           <w:rFonts w:ascii="Garamond" w:hAnsi="Garamond" w:cs="Garamond"/>
           <w:b/>
           <w:color w:val="000000"/>
-          <w:sz w:val="28"/>
-          <w:u w:val="single"/>
-          <w:lang w:val="tr-TR"/>
-        </w:rPr>
-        <w:t>Prototip geliştirme ve test raporu</w:t>
-      </w:r>
-    </w:p>
-    <w:p>
-      <w:pPr>
-        <w:spacing w:after="120" w:line="360" w:lineRule="auto"/>
-      </w:pPr>
-      <w:r>
-        <w:rPr>
-          <w:rFonts w:ascii="Garamond" w:hAnsi="Garamond" w:cs="Garamond"/>
-          <w:color w:val="000000"/>
-          <w:lang w:val="tr-TR"/>
-        </w:rPr>
-        <w:t xml:space="preserve">Proje: </w:t>
-      </w:r>
+          <w:sz w:val="44"/>
+          <w:szCs w:val="56"/>
+          <w:lang w:val="tr-TR"/>
+        </w:rPr>
+      </w:pPr>
       <w:proofErr w:type="spellStart"/>
       <w:r>
         <w:rPr>
           <w:rFonts w:ascii="Garamond" w:hAnsi="Garamond" w:cs="Garamond"/>
-          <w:color w:val="000000"/>
-          <w:lang w:val="tr-TR"/>
-        </w:rPr>
-        <w:t>ModbusProjesi</w:t>
+          <w:b/>
+          <w:color w:val="000000"/>
+          <w:sz w:val="44"/>
+          <w:szCs w:val="56"/>
+          <w:lang w:val="tr-TR"/>
+        </w:rPr>
+        <w:t>Modbus</w:t>
       </w:r>
       <w:proofErr w:type="spellEnd"/>
       <w:r>
         <w:rPr>
           <w:rFonts w:ascii="Garamond" w:hAnsi="Garamond" w:cs="Garamond"/>
-          <w:color w:val="000000"/>
-          <w:lang w:val="tr-TR"/>
-        </w:rPr>
-        <w:t xml:space="preserve"> Saha</w:t>
-      </w:r>
-      <w:r>
-        <w:rPr>
-          <w:rFonts w:ascii="Garamond" w:hAnsi="Garamond" w:cs="Garamond"/>
-          <w:color w:val="000000"/>
-          <w:lang w:val="tr-TR"/>
-        </w:rPr>
-        <w:br/>
-        <w:t>Dönem: 7–11 Eylül 2026</w:t>
-      </w:r>
-      <w:r>
-        <w:rPr>
-          <w:rFonts w:ascii="Garamond" w:hAnsi="Garamond" w:cs="Garamond"/>
-          <w:color w:val="000000"/>
-          <w:lang w:val="tr-TR"/>
-        </w:rPr>
-        <w:br/>
-        <w:t>Rapor tarihi: 11 Eylül 2026</w:t>
-      </w:r>
-      <w:r>
-        <w:rPr>
-          <w:rFonts w:ascii="Garamond" w:hAnsi="Garamond" w:cs="Garamond"/>
-          <w:color w:val="000000"/>
-          <w:lang w:val="tr-TR"/>
-        </w:rPr>
-        <w:br/>
-        <w:t xml:space="preserve">Aşama: Tek kanal donanım </w:t>
-      </w:r>
-      <w:proofErr w:type="gramStart"/>
-      <w:r>
-        <w:rPr>
-          <w:rFonts w:ascii="Garamond" w:hAnsi="Garamond" w:cs="Garamond"/>
-          <w:color w:val="000000"/>
-          <w:lang w:val="tr-TR"/>
-        </w:rPr>
-        <w:t>prototipi</w:t>
-      </w:r>
-      <w:proofErr w:type="gramEnd"/>
-      <w:r>
-        <w:rPr>
-          <w:rFonts w:ascii="Garamond" w:hAnsi="Garamond" w:cs="Garamond"/>
-          <w:color w:val="000000"/>
-          <w:lang w:val="tr-TR"/>
-        </w:rPr>
-        <w:t xml:space="preserve"> ve yazılım entegrasyonuna hazırlık</w:t>
-      </w:r>
+          <w:b/>
+          <w:color w:val="000000"/>
+          <w:sz w:val="44"/>
+          <w:szCs w:val="56"/>
+          <w:lang w:val="tr-TR"/>
+        </w:rPr>
+        <w:t xml:space="preserve"> Projesi Donanım Raporu</w:t>
+      </w:r>
+      <w:bookmarkStart w:id="0" w:name="_GoBack"/>
+      <w:bookmarkEnd w:id="0"/>
     </w:p>
     <w:p>
       <w:pPr>
@@ -175,6 +58,100 @@
           <w:u w:val="single"/>
           <w:lang w:val="tr-TR"/>
         </w:rPr>
+        <w:t>Prototip geliştirme ve test raporu</w:t>
+      </w:r>
+    </w:p>
+    <w:p>
+      <w:pPr>
+        <w:spacing w:after="120" w:line="360" w:lineRule="auto"/>
+      </w:pPr>
+      <w:r>
+        <w:rPr>
+          <w:rFonts w:ascii="Garamond" w:hAnsi="Garamond" w:cs="Garamond"/>
+          <w:color w:val="000000"/>
+          <w:lang w:val="tr-TR"/>
+        </w:rPr>
+        <w:t xml:space="preserve">Proje: </w:t>
+      </w:r>
+      <w:proofErr w:type="spellStart"/>
+      <w:r>
+        <w:rPr>
+          <w:rFonts w:ascii="Garamond" w:hAnsi="Garamond" w:cs="Garamond"/>
+          <w:color w:val="000000"/>
+          <w:lang w:val="tr-TR"/>
+        </w:rPr>
+        <w:t>ModbusProjesi</w:t>
+      </w:r>
+      <w:proofErr w:type="spellEnd"/>
+      <w:r>
+        <w:rPr>
+          <w:rFonts w:ascii="Garamond" w:hAnsi="Garamond" w:cs="Garamond"/>
+          <w:color w:val="000000"/>
+          <w:lang w:val="tr-TR"/>
+        </w:rPr>
+        <w:t xml:space="preserve"> Saha</w:t>
+      </w:r>
+      <w:r>
+        <w:rPr>
+          <w:rFonts w:ascii="Garamond" w:hAnsi="Garamond" w:cs="Garamond"/>
+          <w:color w:val="000000"/>
+          <w:lang w:val="tr-TR"/>
+        </w:rPr>
+        <w:br/>
+        <w:t>Dönem: 7–11 Eylül 2026</w:t>
+      </w:r>
+      <w:r>
+        <w:rPr>
+          <w:rFonts w:ascii="Garamond" w:hAnsi="Garamond" w:cs="Garamond"/>
+          <w:color w:val="000000"/>
+          <w:lang w:val="tr-TR"/>
+        </w:rPr>
+        <w:br/>
+        <w:t>Rapor tarihi: 11 Eylül 2026</w:t>
+      </w:r>
+      <w:r>
+        <w:rPr>
+          <w:rFonts w:ascii="Garamond" w:hAnsi="Garamond" w:cs="Garamond"/>
+          <w:color w:val="000000"/>
+          <w:lang w:val="tr-TR"/>
+        </w:rPr>
+        <w:br/>
+        <w:t xml:space="preserve">Aşama: Tek kanal donanım </w:t>
+      </w:r>
+      <w:proofErr w:type="gramStart"/>
+      <w:r>
+        <w:rPr>
+          <w:rFonts w:ascii="Garamond" w:hAnsi="Garamond" w:cs="Garamond"/>
+          <w:color w:val="000000"/>
+          <w:lang w:val="tr-TR"/>
+        </w:rPr>
+        <w:t>prototipi</w:t>
+      </w:r>
+      <w:proofErr w:type="gramEnd"/>
+      <w:r>
+        <w:rPr>
+          <w:rFonts w:ascii="Garamond" w:hAnsi="Garamond" w:cs="Garamond"/>
+          <w:color w:val="000000"/>
+          <w:lang w:val="tr-TR"/>
+        </w:rPr>
+        <w:t xml:space="preserve"> ve yazılım entegrasyonuna hazırlık</w:t>
+      </w:r>
+    </w:p>
+    <w:p>
+      <w:pPr>
+        <w:pStyle w:val="Balk1"/>
+        <w:spacing w:before="160" w:after="120" w:line="260" w:lineRule="auto"/>
+        <w:jc w:val="center"/>
+      </w:pPr>
+      <w:r>
+        <w:rPr>
+          <w:rFonts w:ascii="Garamond" w:hAnsi="Garamond" w:cs="Garamond"/>
+          <w:b/>
+          <w:color w:val="000000"/>
+          <w:sz w:val="28"/>
+          <w:u w:val="single"/>
+          <w:lang w:val="tr-TR"/>
+        </w:rPr>
         <w:t>1 Yönetici özeti</w:t>
       </w:r>
     </w:p>
@@ -206,7 +183,15 @@
           <w:color w:val="000000"/>
           <w:lang w:val="tr-TR"/>
         </w:rPr>
-        <w:t xml:space="preserve"> kuruldu. Gerçek makine yerine harici LED </w:t>
+        <w:t xml:space="preserve"> kuruldu. Gerçek makine yerine</w:t>
+      </w:r>
+      <w:r>
+        <w:rPr>
+          <w:rFonts w:ascii="Garamond" w:hAnsi="Garamond" w:cs="Garamond"/>
+          <w:color w:val="000000"/>
+          <w:lang w:val="tr-TR"/>
+        </w:rPr>
+        <w:t xml:space="preserve"> harici LED </w:t>
       </w:r>
       <w:proofErr w:type="gramStart"/>
       <w:r>
@@ -237,7 +222,15 @@
           <w:color w:val="000000"/>
           <w:lang w:val="tr-TR"/>
         </w:rPr>
-        <w:t xml:space="preserve">Tarayıcı üzerinden verilen komutun HW-584 çıkışını, seri diyot üzerinden Röle 1’i ve COM–NO kontağına bağlı LED’i değiştirdiği kullanıcı tarafından doğrulandı. Çalışan düzende /00 röleyi çektirip LED’i yakıyor; /01 röleyi bıraktırıp LED’i söndürüyor. Bu nedenle </w:t>
+        <w:t>Tarayıcı üzerinden verilen komutun HW-584 çıkışını, seri diyot üzerinden Röle 1’i ve COM–NO kontağına bağlı LED’i değiştirdiği kullanıcı tarafından doğrulandı. Çalışan düzende /00 röleyi çektirip LED’i yakıyor; /01 röleyi bır</w:t>
+      </w:r>
+      <w:r>
+        <w:rPr>
+          <w:rFonts w:ascii="Garamond" w:hAnsi="Garamond" w:cs="Garamond"/>
+          <w:color w:val="000000"/>
+          <w:lang w:val="tr-TR"/>
+        </w:rPr>
+        <w:t xml:space="preserve">aktırıp LED’i söndürüyor. Bu nedenle </w:t>
       </w:r>
       <w:proofErr w:type="gramStart"/>
       <w:r>
@@ -286,7 +279,15 @@
           <w:color w:val="000000"/>
           <w:lang w:val="tr-TR"/>
         </w:rPr>
-        <w:t xml:space="preserve"> testi sonraki iş olarak kaldı. Gerçek makinenin stop devresine bağlantı ve makinenin fiilen durdurulması bu </w:t>
+        <w:t xml:space="preserve"> testi sonraki iş olarak kal</w:t>
+      </w:r>
+      <w:r>
+        <w:rPr>
+          <w:rFonts w:ascii="Garamond" w:hAnsi="Garamond" w:cs="Garamond"/>
+          <w:color w:val="000000"/>
+          <w:lang w:val="tr-TR"/>
+        </w:rPr>
+        <w:t xml:space="preserve">dı. Gerçek makinenin stop devresine bağlantı ve makinenin fiilen durdurulması bu </w:t>
       </w:r>
       <w:proofErr w:type="gramStart"/>
       <w:r>
@@ -389,7 +390,15 @@
           <w:color w:val="000000"/>
           <w:lang w:val="tr-TR"/>
         </w:rPr>
-        <w:t xml:space="preserve"> haritası veya </w:t>
+        <w:t xml:space="preserve"> hari</w:t>
+      </w:r>
+      <w:r>
+        <w:rPr>
+          <w:rFonts w:ascii="Garamond" w:hAnsi="Garamond" w:cs="Garamond"/>
+          <w:color w:val="000000"/>
+          <w:lang w:val="tr-TR"/>
+        </w:rPr>
+        <w:t xml:space="preserve">tası veya </w:t>
       </w:r>
       <w:proofErr w:type="spellStart"/>
       <w:r>
@@ -851,7 +860,16 @@
                 <w:sz w:val="22"/>
                 <w:lang w:val="tr-TR"/>
               </w:rPr>
-              <w:t>Kart beslemesi; ilk etiket okuması 5,2 V / 2,0 A.</w:t>
+              <w:t xml:space="preserve">Kart beslemesi; ilk etiket okuması 5,2 V </w:t>
+            </w:r>
+            <w:r>
+              <w:rPr>
+                <w:rFonts w:ascii="Garamond" w:hAnsi="Garamond" w:cs="Garamond"/>
+                <w:color w:val="000000"/>
+                <w:sz w:val="22"/>
+                <w:lang w:val="tr-TR"/>
+              </w:rPr>
+              <w:t>/ 2,0 A.</w:t>
             </w:r>
           </w:p>
         </w:tc>
@@ -1350,7 +1368,15 @@
           <w:color w:val="000000"/>
           <w:lang w:val="tr-TR"/>
         </w:rPr>
-        <w:t xml:space="preserve"> kontaklardır. Kartın DC beslemesi, bu kontaklara kendiliğinden yük gerilimi sağlamaz.</w:t>
+        <w:t xml:space="preserve"> kontaklardır. Kartın DC beslemesi, bu kont</w:t>
+      </w:r>
+      <w:r>
+        <w:rPr>
+          <w:rFonts w:ascii="Garamond" w:hAnsi="Garamond" w:cs="Garamond"/>
+          <w:color w:val="000000"/>
+          <w:lang w:val="tr-TR"/>
+        </w:rPr>
+        <w:t>aklara kendiliğinden yük gerilimi sağlamaz.</w:t>
       </w:r>
     </w:p>
     <w:p>
@@ -1777,7 +1803,16 @@
                 <w:sz w:val="22"/>
                 <w:lang w:val="tr-TR"/>
               </w:rPr>
-              <w:t>192.168.1.4:8080 üzerinden NewDevice000 paneli açıldı.</w:t>
+              <w:t>192.168.1.4:8080 üzerinden NewDevice000 paneli açı</w:t>
+            </w:r>
+            <w:r>
+              <w:rPr>
+                <w:rFonts w:ascii="Garamond" w:hAnsi="Garamond" w:cs="Garamond"/>
+                <w:color w:val="000000"/>
+                <w:sz w:val="22"/>
+                <w:lang w:val="tr-TR"/>
+              </w:rPr>
+              <w:t>ldı.</w:t>
             </w:r>
           </w:p>
         </w:tc>
@@ -2458,7 +2493,15 @@
           <w:color w:val="000000"/>
           <w:lang w:val="tr-TR"/>
         </w:rPr>
-        <w:t>Geliştirme boyunca ilk varsayımlar ölçümlerle değişti. Özellikle “ON makineyi başlatır”, “soketler oturuyorsa kartlar uyumludur” ve “yüksek okunan gerilim gerçek besleme gerilimidir” yorumları, son doğrulanan düzenin yerine kullanılmamalıdır.</w:t>
+        <w:t>Geliştirme boyunca ilk varsayımlar ölçümlerle değişti. Özellikle “ON makineyi başlatır”, “soketler oturuyorsa kartlar uyumludur” ve “yüksek okunan gerilim gerçek besleme gerilimidir” yorumları, son doğru</w:t>
+      </w:r>
+      <w:r>
+        <w:rPr>
+          <w:rFonts w:ascii="Garamond" w:hAnsi="Garamond" w:cs="Garamond"/>
+          <w:color w:val="000000"/>
+          <w:lang w:val="tr-TR"/>
+        </w:rPr>
+        <w:t>lanan düzenin yerine kullanılmamalıdır.</w:t>
       </w:r>
     </w:p>
     <w:p>
@@ -2531,7 +2574,15 @@
           <w:color w:val="000000"/>
           <w:lang w:val="tr-TR"/>
         </w:rPr>
-        <w:t xml:space="preserve"> kalemlerinin kablolarından kopmuş olması, metal uçla ölçüm yapılamamasına ve süreklilik testinin sonuç vermemesine yol açtı.</w:t>
+        <w:t xml:space="preserve"> kalemle</w:t>
+      </w:r>
+      <w:r>
+        <w:rPr>
+          <w:rFonts w:ascii="Garamond" w:hAnsi="Garamond" w:cs="Garamond"/>
+          <w:color w:val="000000"/>
+          <w:lang w:val="tr-TR"/>
+        </w:rPr>
+        <w:t>rinin kablolarından kopmuş olması, metal uçla ölçüm yapılamamasına ve süreklilik testinin sonuç vermemesine yol açtı.</w:t>
       </w:r>
     </w:p>
     <w:p>
@@ -2562,7 +2613,15 @@
           <w:color w:val="000000"/>
           <w:lang w:val="tr-TR"/>
         </w:rPr>
-        <w:t xml:space="preserve"> 9,02 V gösterdi. Bilinen 1,5 V AA pilin 2,81 V ölçülmesi, ilk günden ölçüm zincirinin güvenilir olmadığını ortaya koydu. Sonraki denemelerde aynı sorun tekrarlandı: adaptörde 8,8 V, 5 V hatlarında yaklaşık 8–8,7 V, </w:t>
+        <w:t xml:space="preserve"> 9,02 V gösterdi. Bilinen 1,5 V AA pilin 2,81 V ölçülmesi, ilk günden ölçü</w:t>
+      </w:r>
+      <w:r>
+        <w:rPr>
+          <w:rFonts w:ascii="Garamond" w:hAnsi="Garamond" w:cs="Garamond"/>
+          <w:color w:val="000000"/>
+          <w:lang w:val="tr-TR"/>
+        </w:rPr>
+        <w:t xml:space="preserve">m zincirinin güvenilir olmadığını ortaya koydu. Sonraki denemelerde aynı sorun tekrarlandı: adaptörde 8,8 V, 5 V hatlarında yaklaşık 8–8,7 V, </w:t>
       </w:r>
       <w:proofErr w:type="spellStart"/>
       <w:r>
@@ -2611,7 +2670,15 @@
           <w:color w:val="000000"/>
           <w:lang w:val="tr-TR"/>
         </w:rPr>
-        <w:t xml:space="preserve"> aynı pili yaklaşık 1,6 V ölçtü; röle kartının lojik hattı 4,98 V ve HW-584 çıkışı 0 V / 3,27 V olarak ölçüldü. Böylece eski cihazın sayısal gerilim sonuçları tasarım referansı olmaktan çıkarıldı.</w:t>
+        <w:t xml:space="preserve"> aynı pili yaklaşık 1,6 V ölçtü; röle kartının lojik hattı 4,98 V ve HW-584 çıkışı 0 V / 3,27 V olarak ölçüldü. Böylece eski cihazın sayısal gerilim sonuçları tasarım referansı olmaktan çıkar</w:t>
+      </w:r>
+      <w:r>
+        <w:rPr>
+          <w:rFonts w:ascii="Garamond" w:hAnsi="Garamond" w:cs="Garamond"/>
+          <w:color w:val="000000"/>
+          <w:lang w:val="tr-TR"/>
+        </w:rPr>
+        <w:t>ıldı.</w:t>
       </w:r>
     </w:p>
     <w:p>
@@ -2670,7 +2737,15 @@
           <w:color w:val="000000"/>
           <w:lang w:val="tr-TR"/>
         </w:rPr>
-        <w:t xml:space="preserve"> prize bağlı olmadığı anlaşıldı. Röle kartında görülen ışıklar, 12 V bobin beslemesinin gerçekten mevcut olduğunu göstermiyordu. Güç kaynağının şebeke girişi ile 12 V çıkışı ayrıştırıldı; iki damarlı kablo yerine topraklı üç damarlı güç kablosu ele alındı. Kablo tutucunun dış kılıfı kavraması ve terminal dışına bakır taşmaması kontrol konusu oldu.</w:t>
+        <w:t xml:space="preserve"> prize bağlı olmadığı anlaşıldı. Röle kartında görülen ışıklar, 12 V bobin beslemesinin gerçekten mevcut olduğunu göstermiyordu. Güç kaynağının şebeke girişi ile 12 V çıkışı ayrıştırı</w:t>
+      </w:r>
+      <w:r>
+        <w:rPr>
+          <w:rFonts w:ascii="Garamond" w:hAnsi="Garamond" w:cs="Garamond"/>
+          <w:color w:val="000000"/>
+          <w:lang w:val="tr-TR"/>
+        </w:rPr>
+        <w:t>ldı; iki damarlı kablo yerine topraklı üç damarlı güç kablosu ele alındı. Kablo tutucunun dış kılıfı kavraması ve terminal dışına bakır taşmaması kontrol konusu oldu.</w:t>
       </w:r>
     </w:p>
     <w:p>
@@ -2683,7 +2758,15 @@
           <w:color w:val="000000"/>
           <w:lang w:val="tr-TR"/>
         </w:rPr>
-        <w:t xml:space="preserve">Son DC bağlantı düzeni kırmızı V+ → DC+ ve siyah V− → DC− olarak netleşti. Şebeke tarafında L, N ve koruma toprağı işaretleri esas alındı. Bu rapordaki bağlantı şemaları, </w:t>
+        <w:t>Son DC bağlantı düzeni kırmızı V+ → DC+ ve siyah V− → DC− olarak netleşti. Şebeke tarafın</w:t>
+      </w:r>
+      <w:r>
+        <w:rPr>
+          <w:rFonts w:ascii="Garamond" w:hAnsi="Garamond" w:cs="Garamond"/>
+          <w:color w:val="000000"/>
+          <w:lang w:val="tr-TR"/>
+        </w:rPr>
+        <w:t xml:space="preserve">da L, N ve koruma toprağı işaretleri esas alındı. Bu rapordaki bağlantı şemaları, </w:t>
       </w:r>
       <w:proofErr w:type="gramStart"/>
       <w:r>
@@ -2730,7 +2813,15 @@
           <w:color w:val="000000"/>
           <w:lang w:val="tr-TR"/>
         </w:rPr>
-        <w:t xml:space="preserve">Ölçüm cihazının referans bir kaynakla kontrolü, kart arızası araştırmasından önce gelmelidir. Eski gerilim okumalarıyla </w:t>
+        <w:t>Ölçüm cihazının referans bir kaynakla kontrolü, kart arızası araştırmasından önce gelmelidir. Esk</w:t>
+      </w:r>
+      <w:r>
+        <w:rPr>
+          <w:rFonts w:ascii="Garamond" w:hAnsi="Garamond" w:cs="Garamond"/>
+          <w:color w:val="000000"/>
+          <w:lang w:val="tr-TR"/>
+        </w:rPr>
+        <w:t xml:space="preserve">i gerilim okumalarıyla </w:t>
       </w:r>
       <w:proofErr w:type="gramStart"/>
       <w:r>
@@ -2809,7 +2900,15 @@
           <w:color w:val="000000"/>
           <w:lang w:val="tr-TR"/>
         </w:rPr>
-        <w:t xml:space="preserve">Şirket bilgisayarında iki Ethernet bağlantısı vardı. Ana bağlantı 192.168.5.183 adresini ve 192.168.5.100 ağ geçidini kullanıyordu. HW-584’e ayrılan </w:t>
+        <w:t>Şirket bilgisayarında iki Ethernet bağlantısı vardı. Ana bağlant</w:t>
+      </w:r>
+      <w:r>
+        <w:rPr>
+          <w:rFonts w:ascii="Garamond" w:hAnsi="Garamond" w:cs="Garamond"/>
+          <w:color w:val="000000"/>
+          <w:lang w:val="tr-TR"/>
+        </w:rPr>
+        <w:t xml:space="preserve">ı 192.168.5.183 adresini ve 192.168.5.100 ağ geçidini kullanıyordu. HW-584’e ayrılan </w:t>
       </w:r>
       <w:proofErr w:type="spellStart"/>
       <w:r>
@@ -2858,7 +2957,15 @@
           <w:color w:val="000000"/>
           <w:lang w:val="tr-TR"/>
         </w:rPr>
-        <w:t xml:space="preserve"> gibi adreslere yapılan ilk </w:t>
+        <w:t xml:space="preserve"> gib</w:t>
+      </w:r>
+      <w:r>
+        <w:rPr>
+          <w:rFonts w:ascii="Garamond" w:hAnsi="Garamond" w:cs="Garamond"/>
+          <w:color w:val="000000"/>
+          <w:lang w:val="tr-TR"/>
+        </w:rPr>
+        <w:t xml:space="preserve">i adreslere yapılan ilk </w:t>
       </w:r>
       <w:proofErr w:type="spellStart"/>
       <w:r>
@@ -2876,7 +2983,15 @@
           <w:color w:val="000000"/>
           <w:lang w:val="tr-TR"/>
         </w:rPr>
-        <w:t xml:space="preserve"> denemeleri yanıltıcı oldu. Bazı yanıtlar şirket ağı üzerinden geliyordu; bir tarayıcı denemesinde Windows Server/IIS sayfası açıldı. Rota izlemede ilk geçidin 192.168.5.100 olması, trafiğin beklenen doğrudan hatta gitmediğini gösterdi. ARP tablosu, kaynak IP ve </w:t>
+        <w:t xml:space="preserve"> denemeleri yanıltıcı oldu. Bazı yanıtlar şirket ağı üzerinden geliyordu; bir tarayıcı denemesinde Windows Server/IIS sayfası açıldı. Rota izlemede ilk geçidin 192.168.5.100 olması, trafiğin beklenen doğrudan hatta gitmediğini g</w:t>
+      </w:r>
+      <w:r>
+        <w:rPr>
+          <w:rFonts w:ascii="Garamond" w:hAnsi="Garamond" w:cs="Garamond"/>
+          <w:color w:val="000000"/>
+          <w:lang w:val="tr-TR"/>
+        </w:rPr>
+        <w:t xml:space="preserve">österdi. ARP tablosu, kaynak IP ve </w:t>
       </w:r>
       <w:proofErr w:type="spellStart"/>
       <w:r>
@@ -2935,7 +3050,15 @@
           <w:color w:val="000000"/>
           <w:lang w:val="tr-TR"/>
         </w:rPr>
-        <w:t xml:space="preserve"> numarasının karışması gibi sorunlar yaşandı. Bir kayıtta 419.577 olay oluştu; buna rağmen kartın IP’sini kesinleştiren bir sonuç alınamadı. Ardından </w:t>
+        <w:t xml:space="preserve"> numarasının karışması gibi sorunlar yaşandı. Bir kayıtta 419.577 olay oluştu; buna rağm</w:t>
+      </w:r>
+      <w:r>
+        <w:rPr>
+          <w:rFonts w:ascii="Garamond" w:hAnsi="Garamond" w:cs="Garamond"/>
+          <w:color w:val="000000"/>
+          <w:lang w:val="tr-TR"/>
+        </w:rPr>
+        <w:t xml:space="preserve">en kartın IP’sini kesinleştiren bir sonuç alınamadı. Ardından </w:t>
       </w:r>
       <w:proofErr w:type="spellStart"/>
       <w:r>
@@ -3048,7 +3171,15 @@
           <w:color w:val="000000"/>
           <w:lang w:val="tr-TR"/>
         </w:rPr>
-        <w:t>Cihazın henüz sahada kullanılmadığı ve yalnızca IP tanımlandığı belirtilince fabrika sıfırlaması yapıldı. İlk yönlendirmelerde 30000 portu düşünülmüştü. Evde diğer ağdan ayrılmış doğrudan bağlantıda 192.168.1.4 yanıt verdi; 80 ve 30000 testleri başarısız olurken TCP taramasında 8080 bulundu. http://192.168.1.4:8080 adresinde IO Control / NewDevice000 paneli açıldı.</w:t>
+        <w:t xml:space="preserve">Cihazın henüz sahada kullanılmadığı ve yalnızca IP tanımlandığı belirtilince fabrika sıfırlaması yapıldı. İlk yönlendirmelerde 30000 portu düşünülmüştü. Evde diğer ağdan ayrılmış doğrudan bağlantıda 192.168.1.4 yanıt verdi; 80 ve </w:t>
+      </w:r>
+      <w:r>
+        <w:rPr>
+          <w:rFonts w:ascii="Garamond" w:hAnsi="Garamond" w:cs="Garamond"/>
+          <w:color w:val="000000"/>
+          <w:lang w:val="tr-TR"/>
+        </w:rPr>
+        <w:t>30000 testleri başarısız olurken TCP taramasında 8080 bulundu. http://192.168.1.4:8080 adresinde IO Control / NewDevice000 paneli açıldı.</w:t>
       </w:r>
     </w:p>
     <w:tbl>
@@ -3473,7 +3604,15 @@
           <w:color w:val="000000"/>
           <w:lang w:val="tr-TR"/>
         </w:rPr>
-        <w:t xml:space="preserve"> adresine dönülerek yapıldı. Şirkette istenen “5’li blok” ifadesi beş ardışık IP değil, 192.168.5.x ağı olarak netleştirildi.</w:t>
+        <w:t xml:space="preserve"> adresine dönülerek yapıldı. Şirkette istenen “5’li blok” ifadesi beş ardışık IP değil, 192.168.5.x ağı</w:t>
+      </w:r>
+      <w:r>
+        <w:rPr>
+          <w:rFonts w:ascii="Garamond" w:hAnsi="Garamond" w:cs="Garamond"/>
+          <w:color w:val="000000"/>
+          <w:lang w:val="tr-TR"/>
+        </w:rPr>
+        <w:t xml:space="preserve"> olarak netleştirildi.</w:t>
       </w:r>
     </w:p>
     <w:p>
@@ -3540,7 +3679,15 @@
           <w:color w:val="000000"/>
           <w:lang w:val="tr-TR"/>
         </w:rPr>
-        <w:t xml:space="preserve"> durumu yeniden dikkate alınarak PC ile doğrudan erişim kuruldu. Nihai cihaz adresi 192.168.5.190 yapıldı; PC </w:t>
+        <w:t xml:space="preserve"> durumu yeniden dikkate alınarak PC ile doğrudan erişim kuruldu. Nihai ciha</w:t>
+      </w:r>
+      <w:r>
+        <w:rPr>
+          <w:rFonts w:ascii="Garamond" w:hAnsi="Garamond" w:cs="Garamond"/>
+          <w:color w:val="000000"/>
+          <w:lang w:val="tr-TR"/>
+        </w:rPr>
+        <w:t xml:space="preserve">z adresi 192.168.5.190 yapıldı; PC </w:t>
       </w:r>
       <w:proofErr w:type="gramStart"/>
       <w:r>
@@ -4104,7 +4251,15 @@
           <w:color w:val="000000"/>
           <w:lang w:val="tr-TR"/>
         </w:rPr>
-        <w:t xml:space="preserve"> yapıldıktan sonra .190:8080 paneli açıldı. Kartın yerel kontrolü için internet veya şirket ağı gerekmediği pratik olarak görüldü.</w:t>
+        <w:t xml:space="preserve"> yapıldıktan sonra .190:8080 paneli açıldı. Kartın yerel kontrolü için </w:t>
+      </w:r>
+      <w:r>
+        <w:rPr>
+          <w:rFonts w:ascii="Garamond" w:hAnsi="Garamond" w:cs="Garamond"/>
+          <w:color w:val="000000"/>
+          <w:lang w:val="tr-TR"/>
+        </w:rPr>
+        <w:t>internet veya şirket ağı gerekmediği pratik olarak görüldü.</w:t>
       </w:r>
     </w:p>
     <w:p>
@@ -4192,7 +4347,15 @@
           <w:color w:val="000000"/>
           <w:lang w:val="tr-TR"/>
         </w:rPr>
-        <w:t>Uygulama şirket SQL Server veya IIS gibi başka hizmetlere bağlıysa bu bağımlılıklar ayrıca ele alınacaktır; kartın doğrudan erişilebilir olması uygulamanın tüm dış bağımlılıklarını ortadan kaldırmaz.</w:t>
+        <w:t>Uygulama şirket SQL Server veya IIS gibi başka hizmetlere bağlıysa bu bağımlılıklar a</w:t>
+      </w:r>
+      <w:r>
+        <w:rPr>
+          <w:rFonts w:ascii="Garamond" w:hAnsi="Garamond" w:cs="Garamond"/>
+          <w:color w:val="000000"/>
+          <w:lang w:val="tr-TR"/>
+        </w:rPr>
+        <w:t>yrıca ele alınacaktır; kartın doğrudan erişilebilir olması uygulamanın tüm dış bağımlılıklarını ortadan kaldırmaz.</w:t>
       </w:r>
     </w:p>
     <w:p>
@@ -4343,7 +4506,15 @@
           <w:color w:val="000000"/>
           <w:lang w:val="tr-TR"/>
         </w:rPr>
-        <w:t xml:space="preserve"> yapıldı. Daha sonra yalnızca IO01’in göründüğü fark edilince IO02–IO16’nın </w:t>
+        <w:t xml:space="preserve"> yapıldı. </w:t>
+      </w:r>
+      <w:r>
+        <w:rPr>
+          <w:rFonts w:ascii="Garamond" w:hAnsi="Garamond" w:cs="Garamond"/>
+          <w:color w:val="000000"/>
+          <w:lang w:val="tr-TR"/>
+        </w:rPr>
+        <w:t xml:space="preserve">Daha sonra yalnızca IO01’in göründüğü fark edilince IO02–IO16’nın </w:t>
       </w:r>
       <w:proofErr w:type="spellStart"/>
       <w:r>
@@ -4451,7 +4622,15 @@
           <w:color w:val="000000"/>
           <w:lang w:val="tr-TR"/>
         </w:rPr>
-        <w:t xml:space="preserve"> alanları tanındı; bunlar için nihai saha davranışı belirlenmedi.</w:t>
+        <w:t xml:space="preserve"> alanları tanındı; bunlar için nihai saha da</w:t>
+      </w:r>
+      <w:r>
+        <w:rPr>
+          <w:rFonts w:ascii="Garamond" w:hAnsi="Garamond" w:cs="Garamond"/>
+          <w:color w:val="000000"/>
+          <w:lang w:val="tr-TR"/>
+        </w:rPr>
+        <w:t>vranışı belirlenmedi.</w:t>
       </w:r>
     </w:p>
     <w:p>
@@ -4492,7 +4671,15 @@
           <w:color w:val="000000"/>
           <w:lang w:val="tr-TR"/>
         </w:rPr>
-        <w:t xml:space="preserve">Kartların iki sıralı soketleri fiziksel olarak birbirine oturuyordu. Başlangıçta bunun doğrudan uyumluluk anlamına geldiği düşünüldü; ancak çok sayıda gösterge ışığının yanması, bir kanalın sönük kalması, tık sesi alınamaması ve cızırtı bu varsayımı geçersiz kıldı. /822 komutuyla </w:t>
+        <w:t>Kartların iki sıralı soketleri fiziksel olarak birbirine oturuyordu. Başlangıçta bunun doğrudan uyumluluk anlamına geldiği düşünüldü; ancak çok sayıda gösterge ışığının yanması, bir kanalın sönük kalması,</w:t>
+      </w:r>
+      <w:r>
+        <w:rPr>
+          <w:rFonts w:ascii="Garamond" w:hAnsi="Garamond" w:cs="Garamond"/>
+          <w:color w:val="000000"/>
+          <w:lang w:val="tr-TR"/>
+        </w:rPr>
+        <w:t xml:space="preserve"> tık sesi alınamaması ve cızırtı bu varsayımı geçersiz kıldı. /822 komutuyla </w:t>
       </w:r>
       <w:proofErr w:type="spellStart"/>
       <w:r>
@@ -4577,7 +4764,15 @@
           <w:color w:val="000000"/>
           <w:lang w:val="tr-TR"/>
         </w:rPr>
-        <w:t xml:space="preserve"> 8, konuşmada kart üzerindeki baskı numarası olarak kullanılan tanımdır; konektörün mekanik bacak sırası ile karıştırılmamalıdır.</w:t>
+        <w:t xml:space="preserve"> 8, konuşmada kart üzerindeki baskı numarası olarak kullanılan tanımdır; konektörün mekanik </w:t>
+      </w:r>
+      <w:r>
+        <w:rPr>
+          <w:rFonts w:ascii="Garamond" w:hAnsi="Garamond" w:cs="Garamond"/>
+          <w:color w:val="000000"/>
+          <w:lang w:val="tr-TR"/>
+        </w:rPr>
+        <w:t>bacak sırası ile karıştırılmamalıdır.</w:t>
       </w:r>
     </w:p>
     <w:p>
@@ -4642,7 +4837,15 @@
           <w:color w:val="000000"/>
           <w:lang w:val="tr-TR"/>
         </w:rPr>
-        <w:t xml:space="preserve"> bağlandığında Röle 1’den tık sesi geldi ve kanal göstergesi değişti. Bu, tek kanal röle kartının çalıştığını ve girişin </w:t>
+        <w:t xml:space="preserve"> bağlandığında Röle 1’den tık sesi geldi ve kanal göstergesi değişti. Bu, tek kanal röle kartının çalıştığını ve</w:t>
+      </w:r>
+      <w:r>
+        <w:rPr>
+          <w:rFonts w:ascii="Garamond" w:hAnsi="Garamond" w:cs="Garamond"/>
+          <w:color w:val="000000"/>
+          <w:lang w:val="tr-TR"/>
+        </w:rPr>
+        <w:t xml:space="preserve"> girişin </w:t>
       </w:r>
       <w:proofErr w:type="spellStart"/>
       <w:r>
@@ -4707,7 +4910,23 @@
           <w:color w:val="000000"/>
           <w:lang w:val="tr-TR"/>
         </w:rPr>
-        <w:t xml:space="preserve"> 8 → IN1 ve HW G → röle GND bağlantısı yapıldı; iki kart ayrı beslendi ve 5 V hatları birleştirilmedi. IO01 OFF komutuna rağmen röle çekmedi. IN1–GND arasında 4,12 V ölçüldü. Bu durum konuşmada geri besleme / giriş seviyesi uyumsuzluğu olarak yorumlandı. Ölçüm ve belirti kayıtlıdır; tek ölçüm, akım yolunun ayrıntılı devre analizinin yerine geçmez.</w:t>
+        <w:t xml:space="preserve"> 8 → IN1 ve HW G → röle</w:t>
+      </w:r>
+      <w:r>
+        <w:rPr>
+          <w:rFonts w:ascii="Garamond" w:hAnsi="Garamond" w:cs="Garamond"/>
+          <w:color w:val="000000"/>
+          <w:lang w:val="tr-TR"/>
+        </w:rPr>
+        <w:t xml:space="preserve"> GND bağlantısı yapıldı; iki kart ayrı beslendi ve 5 V hatları birleştirilmedi. IO01 OFF komutuna rağmen röle çekmedi. IN1–GND arasında 4,12 V ölçüldü. Bu durum konuşmada geri besleme / giriş seviyesi uyumsuzluğu olarak yorumlandı. Ölçüm ve belirti kayıtlı</w:t>
+      </w:r>
+      <w:r>
+        <w:rPr>
+          <w:rFonts w:ascii="Garamond" w:hAnsi="Garamond" w:cs="Garamond"/>
+          <w:color w:val="000000"/>
+          <w:lang w:val="tr-TR"/>
+        </w:rPr>
+        <w:t>dır; tek ölçüm, akım yolunun ayrıntılı devre analizinin yerine geçmez.</w:t>
       </w:r>
     </w:p>
     <w:p>
@@ -4754,7 +4973,15 @@
           <w:color w:val="000000"/>
           <w:lang w:val="tr-TR"/>
         </w:rPr>
-        <w:t xml:space="preserve"> 8 ile IN1 arasına seri diyot eklendi. Elindeki parçanın 1N400x ailesinden olabileceği değerlendirildi; kesin parça kodu doğrulanmadı. Diyot testinde bir yönde “568”, yani yaklaşık 0,568 V, ters yönde “1” / açık devre görüldü. 1N4148 ise daha sonra ara kart için önerilen parçaydı; ilk testte kullanılan diyotla aynı parça olarak kabul edilmemelidir.</w:t>
+        <w:t xml:space="preserve"> 8 ile IN1 arasına seri diyot eklendi. Elindeki parçanın 1N400x ailesinden olabileceği değerlendirildi; kesin parça kodu doğrulanmadı. Diy</w:t>
+      </w:r>
+      <w:r>
+        <w:rPr>
+          <w:rFonts w:ascii="Garamond" w:hAnsi="Garamond" w:cs="Garamond"/>
+          <w:color w:val="000000"/>
+          <w:lang w:val="tr-TR"/>
+        </w:rPr>
+        <w:t>ot testinde bir yönde “568”, yani yaklaşık 0,568 V, ters yönde “1” / açık devre görüldü. 1N4148 ise daha sonra ara kart için önerilen parçaydı; ilk testte kullanılan diyotla aynı parça olarak kabul edilmemelidir.</w:t>
       </w:r>
     </w:p>
     <w:p>
@@ -4785,7 +5012,16 @@
           <w:sz w:val="19"/>
           <w:lang w:val="tr-TR"/>
         </w:rPr>
-        <w:t xml:space="preserve">Röle kartı IN1 ── A [ SERİ DİYOT ] K ── HW </w:t>
+        <w:t>Röle k</w:t>
+      </w:r>
+      <w:r>
+        <w:rPr>
+          <w:rFonts w:ascii="Consolas" w:hAnsi="Consolas" w:cs="Consolas"/>
+          <w:color w:val="000000"/>
+          <w:sz w:val="19"/>
+          <w:lang w:val="tr-TR"/>
+        </w:rPr>
+        <w:t xml:space="preserve">artı IN1 ── A [ SERİ DİYOT ] K ── HW </w:t>
       </w:r>
       <w:proofErr w:type="spellStart"/>
       <w:r>
@@ -4990,7 +5226,15 @@
           <w:color w:val="000000"/>
           <w:lang w:val="tr-TR"/>
         </w:rPr>
-        <w:t xml:space="preserve"> bağlantısı yapıldıktan sonra HW-584 üzerinde önce IO01 ON seçildi; ardından </w:t>
+        <w:t xml:space="preserve"> bağlantısı yapıldıktan sonra HW-584 üzerin</w:t>
+      </w:r>
+      <w:r>
+        <w:rPr>
+          <w:rFonts w:ascii="Garamond" w:hAnsi="Garamond" w:cs="Garamond"/>
+          <w:color w:val="000000"/>
+          <w:lang w:val="tr-TR"/>
+        </w:rPr>
+        <w:t xml:space="preserve">de önce IO01 ON seçildi; ardından </w:t>
       </w:r>
       <w:proofErr w:type="spellStart"/>
       <w:r>
@@ -5026,7 +5270,15 @@
           <w:color w:val="000000"/>
           <w:lang w:val="tr-TR"/>
         </w:rPr>
-        <w:t xml:space="preserve"> göstergesi değil, rölenin çekme ve bırakma davranışı gözlendi.</w:t>
+        <w:t xml:space="preserve"> göstergesi değil, </w:t>
+      </w:r>
+      <w:r>
+        <w:rPr>
+          <w:rFonts w:ascii="Garamond" w:hAnsi="Garamond" w:cs="Garamond"/>
+          <w:color w:val="000000"/>
+          <w:lang w:val="tr-TR"/>
+        </w:rPr>
+        <w:t>rölenin çekme ve bırakma davranışı gözlendi.</w:t>
       </w:r>
     </w:p>
     <w:tbl>
@@ -5348,7 +5600,15 @@
           <w:color w:val="000000"/>
           <w:lang w:val="tr-TR"/>
         </w:rPr>
-        <w:t xml:space="preserve">Röle kartının DC+ / DC− beslemesi ile COM / NO / NC çıkışları arasındaki fark netleştirildi. COM ortak uç, NO röle bırakmışken açık olan kontak, NC ise röle bırakmışken kapalı olan kontaktır. LED’in iki ucunu yalnızca COM ve </w:t>
+        <w:t>Röle kartının DC+ / DC− beslemesi ile COM / NO / NC çıkışları arasındaki fark netleştirildi. COM ortak uç, NO röle bırakmışken açık olan kontak, NC ise röle bırakmışken kapalı olan kontaktır. LED’in iki ucunu y</w:t>
+      </w:r>
+      <w:r>
+        <w:rPr>
+          <w:rFonts w:ascii="Garamond" w:hAnsi="Garamond" w:cs="Garamond"/>
+          <w:color w:val="000000"/>
+          <w:lang w:val="tr-TR"/>
+        </w:rPr>
+        <w:t xml:space="preserve">alnızca COM ve </w:t>
       </w:r>
       <w:proofErr w:type="spellStart"/>
       <w:r>
@@ -5438,6 +5698,14 @@
           <w:lang w:val="tr-TR"/>
         </w:rPr>
         <w:br/>
+      </w:r>
+      <w:r>
+        <w:rPr>
+          <w:rFonts w:ascii="Consolas" w:hAnsi="Consolas" w:cs="Consolas"/>
+          <w:color w:val="000000"/>
+          <w:sz w:val="19"/>
+          <w:lang w:val="tr-TR"/>
+        </w:rPr>
         <w:t xml:space="preserve">                    [COM–NO kontağı]</w:t>
       </w:r>
       <w:r>
@@ -5538,7 +5806,15 @@
           <w:color w:val="000000"/>
           <w:lang w:val="tr-TR"/>
         </w:rPr>
-        <w:t xml:space="preserve">Kırmızı LED kablosu kırmızı ek damarla uzatıldı; siyah dönüş hattı DC−’ye götürüldü. Başlangıçta çıplak LED için 1 </w:t>
+        <w:t>Kırmızı LED kablosu kırmızı ek dama</w:t>
+      </w:r>
+      <w:r>
+        <w:rPr>
+          <w:rFonts w:ascii="Garamond" w:hAnsi="Garamond" w:cs="Garamond"/>
+          <w:color w:val="000000"/>
+          <w:lang w:val="tr-TR"/>
+        </w:rPr>
+        <w:t xml:space="preserve">rla uzatıldı; siyah dönüş hattı DC−’ye götürüldü. Başlangıçta çıplak LED için 1 </w:t>
       </w:r>
       <w:proofErr w:type="spellStart"/>
       <w:r>
@@ -5940,7 +6216,15 @@
           <w:color w:val="000000"/>
           <w:lang w:val="tr-TR"/>
         </w:rPr>
-        <w:t>Gerçek makine durduğunda kendi uyarı lambasını yakmaktadır. Prototip LED’i gerçek kurulumda olmayacaktır. Bu yüzden yalnızca lamba davranışına bakarak NO yerine NC seçilmez; seçim, makinenin stop girişinin beklediği kontak davranışına göre yapılacaktır.</w:t>
+        <w:t>Gerçek makine dur</w:t>
+      </w:r>
+      <w:r>
+        <w:rPr>
+          <w:rFonts w:ascii="Garamond" w:hAnsi="Garamond" w:cs="Garamond"/>
+          <w:color w:val="000000"/>
+          <w:lang w:val="tr-TR"/>
+        </w:rPr>
+        <w:t>duğunda kendi uyarı lambasını yakmaktadır. Prototip LED’i gerçek kurulumda olmayacaktır. Bu yüzden yalnızca lamba davranışına bakarak NO yerine NC seçilmez; seçim, makinenin stop girişinin beklediği kontak davranışına göre yapılacaktır.</w:t>
       </w:r>
     </w:p>
     <w:p>
@@ -6392,7 +6676,16 @@
                 <w:sz w:val="22"/>
                 <w:lang w:val="tr-TR"/>
               </w:rPr>
-              <w:t>Erken GPIO ölçümleri</w:t>
+              <w:t>Erken GPIO ölçüml</w:t>
+            </w:r>
+            <w:r>
+              <w:rPr>
+                <w:rFonts w:ascii="Garamond" w:hAnsi="Garamond" w:cs="Garamond"/>
+                <w:color w:val="000000"/>
+                <w:sz w:val="22"/>
+                <w:lang w:val="tr-TR"/>
+              </w:rPr>
+              <w:t>eri</w:t>
             </w:r>
           </w:p>
         </w:tc>
@@ -7040,7 +7333,15 @@
           <w:color w:val="000000"/>
           <w:lang w:val="tr-TR"/>
         </w:rPr>
-        <w:t xml:space="preserve"> ayarı, ayrı beslemeler, ortak GND ve seri diyotlu tek kanal düzeniyle çalışır sonuç elde edildi.</w:t>
+        <w:t xml:space="preserve"> aya</w:t>
+      </w:r>
+      <w:r>
+        <w:rPr>
+          <w:rFonts w:ascii="Garamond" w:hAnsi="Garamond" w:cs="Garamond"/>
+          <w:color w:val="000000"/>
+          <w:lang w:val="tr-TR"/>
+        </w:rPr>
+        <w:t>rı, ayrı beslemeler, ortak GND ve seri diyotlu tek kanal düzeniyle çalışır sonuç elde edildi.</w:t>
       </w:r>
     </w:p>
     <w:p>
@@ -7101,7 +7402,15 @@
           <w:color w:val="000000"/>
           <w:lang w:val="tr-TR"/>
         </w:rPr>
-        <w:t xml:space="preserve">Entegrasyonun hedefi mevcut ASP.NET/C# mimarisinde test makinesini Röle 1’e atamak ve DURDUR butonunun HTTP komutunu bu kanala göndermesidir. Tarayıcı testi tamamlandı; uygulama butonu → </w:t>
+        <w:t>Entegrasyonun hedefi mevcut ASP.NET/C# mimarisinde test makinesini Röle 1’e atamak ve DURDUR butonunun HTTP komutunu bu</w:t>
+      </w:r>
+      <w:r>
+        <w:rPr>
+          <w:rFonts w:ascii="Garamond" w:hAnsi="Garamond" w:cs="Garamond"/>
+          <w:color w:val="000000"/>
+          <w:lang w:val="tr-TR"/>
+        </w:rPr>
+        <w:t xml:space="preserve"> kanala göndermesidir. Tarayıcı testi tamamlandı; uygulama butonu → </w:t>
       </w:r>
       <w:proofErr w:type="spellStart"/>
       <w:r>
@@ -7431,7 +7740,15 @@
           <w:color w:val="000000"/>
           <w:lang w:val="tr-TR"/>
         </w:rPr>
-        <w:t xml:space="preserve"> tersliğini kullanıcı ekranından ayıracaktır. Tek bir yeniden kullanılan veya bağımlılık </w:t>
+        <w:t xml:space="preserve"> tersliğini kullanıcı ekranından ayıracaktır. Tek bir y</w:t>
+      </w:r>
+      <w:r>
+        <w:rPr>
+          <w:rFonts w:ascii="Garamond" w:hAnsi="Garamond" w:cs="Garamond"/>
+          <w:color w:val="000000"/>
+          <w:lang w:val="tr-TR"/>
+        </w:rPr>
+        <w:t xml:space="preserve">eniden kullanılan veya bağımlılık </w:t>
       </w:r>
       <w:proofErr w:type="gramStart"/>
       <w:r>
@@ -7480,7 +7797,15 @@
           <w:color w:val="000000"/>
           <w:lang w:val="tr-TR"/>
         </w:rPr>
-        <w:t xml:space="preserve">Kullanıcıya “Makine kontrol cihazına ulaşılamadı” gibi anlaşılır hata verilmesi ve uygulamanın kilitlenmemesi hedeflendi. Makine, kanal, komutu veren kullanıcı, durdurma nedeni, zaman ve istek sonucu kayıt altına alınmalıdır. Bu maddeler </w:t>
+        <w:t>Kullanıcıya “Makine kontrol cihazına ulaşılamadı” gibi anlaşılır hata veri</w:t>
+      </w:r>
+      <w:r>
+        <w:rPr>
+          <w:rFonts w:ascii="Garamond" w:hAnsi="Garamond" w:cs="Garamond"/>
+          <w:color w:val="000000"/>
+          <w:lang w:val="tr-TR"/>
+        </w:rPr>
+        <w:t xml:space="preserve">lmesi ve uygulamanın kilitlenmemesi hedeflendi. Makine, kanal, komutu veren kullanıcı, durdurma nedeni, zaman ve istek sonucu kayıt altına alınmalıdır. Bu maddeler </w:t>
       </w:r>
       <w:proofErr w:type="gramStart"/>
       <w:r>
@@ -7514,7 +7839,17 @@
           <w:sz w:val="25"/>
           <w:lang w:val="tr-TR"/>
         </w:rPr>
-        <w:t>Komut ile fiziksel durumun ayrılması</w:t>
+        <w:t>Komut</w:t>
+      </w:r>
+      <w:r>
+        <w:rPr>
+          <w:rFonts w:ascii="Garamond" w:hAnsi="Garamond" w:cs="Garamond"/>
+          <w:b/>
+          <w:color w:val="000000"/>
+          <w:sz w:val="25"/>
+          <w:lang w:val="tr-TR"/>
+        </w:rPr>
+        <w:t xml:space="preserve"> ile fiziksel durumun ayrılması</w:t>
       </w:r>
     </w:p>
     <w:p>
@@ -7527,7 +7862,15 @@
           <w:color w:val="000000"/>
           <w:lang w:val="tr-TR"/>
         </w:rPr>
-        <w:t>HTTP yanıtı, isteğin sonucunu bildirir; gerçek makinenin durduğunun bağımsız kanıtı değildir. /98 ve /99 ile IO durumunun okunması konuşuldu; yanıt biçimi ve makine geri bildirimi henüz tanımlanmadı. Ekrandaki “komut gönderildi” ve “makine durdu” durumlarının nasıl doğrulanacağı gerçek makine testinde netleştirilecektir.</w:t>
+        <w:t>HTTP yanıtı, isteğin sonucunu bildirir; gerçek makinenin durduğunun bağımsız kanıtı değildir. /98 ve /99 ile IO durumunun okunması konuşuldu; yanıt biçimi ve makine geri bildirimi henüz tanımlanmadı. Ekrandaki “komut gönderi</w:t>
+      </w:r>
+      <w:r>
+        <w:rPr>
+          <w:rFonts w:ascii="Garamond" w:hAnsi="Garamond" w:cs="Garamond"/>
+          <w:color w:val="000000"/>
+          <w:lang w:val="tr-TR"/>
+        </w:rPr>
+        <w:t>ldi” ve “makine durdu” durumlarının nasıl doğrulanacağı gerçek makine testinde netleştirilecektir.</w:t>
       </w:r>
     </w:p>
     <w:p>
@@ -7596,7 +7939,15 @@
           <w:color w:val="000000"/>
           <w:lang w:val="tr-TR"/>
         </w:rPr>
-        <w:t xml:space="preserve"> veya araya eklenmiş diyot görmediğini belirtti. Kartın HW-523 ailesine benzediği düşünüldü; tam PCB modeli ve güç kapasitesi kesinleştirilmedi.</w:t>
+        <w:t xml:space="preserve"> veya araya eklenmiş diyot görmediğini belirtti. Kartı</w:t>
+      </w:r>
+      <w:r>
+        <w:rPr>
+          <w:rFonts w:ascii="Garamond" w:hAnsi="Garamond" w:cs="Garamond"/>
+          <w:color w:val="000000"/>
+          <w:lang w:val="tr-TR"/>
+        </w:rPr>
+        <w:t>n HW-523 ailesine benzediği düşünüldü; tam PCB modeli ve güç kapasitesi kesinleştirilmedi.</w:t>
       </w:r>
     </w:p>
     <w:tbl>
@@ -8137,7 +8488,15 @@
           <w:color w:val="000000"/>
           <w:lang w:val="tr-TR"/>
         </w:rPr>
-        <w:t>Powerlux’un</w:t>
+        <w:t>Pow</w:t>
+      </w:r>
+      <w:r>
+        <w:rPr>
+          <w:rFonts w:ascii="Garamond" w:hAnsi="Garamond" w:cs="Garamond"/>
+          <w:color w:val="000000"/>
+          <w:lang w:val="tr-TR"/>
+        </w:rPr>
+        <w:t>erlux’un</w:t>
       </w:r>
       <w:proofErr w:type="spellEnd"/>
       <w:r>
@@ -8239,7 +8598,15 @@
           <w:color w:val="000000"/>
           <w:lang w:val="tr-TR"/>
         </w:rPr>
-        <w:t xml:space="preserve">, 16 adet 1N4148, 18 adet ikili 5,08 mm PCB </w:t>
+        <w:t xml:space="preserve">, 16 adet 1N4148, </w:t>
+      </w:r>
+      <w:r>
+        <w:rPr>
+          <w:rFonts w:ascii="Garamond" w:hAnsi="Garamond" w:cs="Garamond"/>
+          <w:color w:val="000000"/>
+          <w:lang w:val="tr-TR"/>
+        </w:rPr>
+        <w:t xml:space="preserve">18 adet ikili 5,08 mm PCB </w:t>
       </w:r>
       <w:proofErr w:type="spellStart"/>
       <w:r>
@@ -8306,7 +8673,15 @@
           <w:color w:val="000000"/>
           <w:lang w:val="tr-TR"/>
         </w:rPr>
-        <w:t xml:space="preserve"> 33; GND 35 ve yedek 37 idi. Her kanal için sol bağlantı sütun 3, diyot uçları 24 ve 30, sağ bağlantı 56 olarak tarif edildi. Çizgili uç HW tarafında, ortak GND doğrudan geçişli, 5 V hattı ise bulunmayacak şekilde düşünüldü. Bu koordinatlar seçilecek gerçek </w:t>
+        <w:t xml:space="preserve"> 33; G</w:t>
+      </w:r>
+      <w:r>
+        <w:rPr>
+          <w:rFonts w:ascii="Garamond" w:hAnsi="Garamond" w:cs="Garamond"/>
+          <w:color w:val="000000"/>
+          <w:lang w:val="tr-TR"/>
+        </w:rPr>
+        <w:t xml:space="preserve">ND 35 ve yedek 37 idi. Her kanal için sol bağlantı sütun 3, diyot uçları 24 ve 30, sağ bağlantı 56 olarak tarif edildi. Çizgili uç HW tarafında, ortak GND doğrudan geçişli, 5 V hattı ise bulunmayacak şekilde düşünüldü. Bu koordinatlar seçilecek gerçek </w:t>
       </w:r>
       <w:proofErr w:type="spellStart"/>
       <w:r>
@@ -8315,7 +8690,15 @@
           <w:color w:val="000000"/>
           <w:lang w:val="tr-TR"/>
         </w:rPr>
-        <w:t>klemens</w:t>
+        <w:t>klem</w:t>
+      </w:r>
+      <w:r>
+        <w:rPr>
+          <w:rFonts w:ascii="Garamond" w:hAnsi="Garamond" w:cs="Garamond"/>
+          <w:color w:val="000000"/>
+          <w:lang w:val="tr-TR"/>
+        </w:rPr>
+        <w:t>ens</w:t>
       </w:r>
       <w:proofErr w:type="spellEnd"/>
       <w:r>
@@ -8397,7 +8780,15 @@
           <w:color w:val="000000"/>
           <w:lang w:val="tr-TR"/>
         </w:rPr>
-        <w:t xml:space="preserve"> 8 ilişkisi bulundu, hatalı ölçümler ayıklandı, röle bağımsız olarak test edildi ve seri diyotlu bağlantıyla çekme/bırakma sağlandı. COM–NO üzerinden harici LED’in </w:t>
+        <w:t xml:space="preserve"> 8 ilişkisi bulundu, hatalı ölçümler</w:t>
+      </w:r>
+      <w:r>
+        <w:rPr>
+          <w:rFonts w:ascii="Garamond" w:hAnsi="Garamond" w:cs="Garamond"/>
+          <w:color w:val="000000"/>
+          <w:lang w:val="tr-TR"/>
+        </w:rPr>
+        <w:t xml:space="preserve"> ayıklandı, röle bağımsız olarak test edildi ve seri diyotlu bağlantıyla çekme/bırakma sağlandı. COM–NO üzerinden harici LED’in </w:t>
       </w:r>
       <w:proofErr w:type="spellStart"/>
       <w:r>
@@ -8892,7 +9283,16 @@
                 <w:sz w:val="22"/>
                 <w:lang w:val="tr-TR"/>
               </w:rPr>
-              <w:t>Komutun fiziksel duruşa etkisi ve makinenin kendi lambası gözlenir.</w:t>
+              <w:t>Komutun f</w:t>
+            </w:r>
+            <w:r>
+              <w:rPr>
+                <w:rFonts w:ascii="Garamond" w:hAnsi="Garamond" w:cs="Garamond"/>
+                <w:color w:val="000000"/>
+                <w:sz w:val="22"/>
+                <w:lang w:val="tr-TR"/>
+              </w:rPr>
+              <w:t>iziksel duruşa etkisi ve makinenin kendi lambası gözlenir.</w:t>
             </w:r>
           </w:p>
         </w:tc>
@@ -9083,7 +9483,15 @@
           <w:color w:val="000000"/>
           <w:lang w:val="tr-TR"/>
         </w:rPr>
-        <w:t xml:space="preserve"> +12 V → COM köprüsü gerçek makineye otomatik olarak taşınmayacaktır. Makinenin kendi kontrol devresinin beklediği kuru kontak yapısı belirlenecek; mevcut acil durdurma işlevi korunacaktır. Bu </w:t>
+        <w:t xml:space="preserve"> +12 V → COM köprüsü gerçek makineye otomatik olarak taşınmayacaktır. Makinenin kend</w:t>
+      </w:r>
+      <w:r>
+        <w:rPr>
+          <w:rFonts w:ascii="Garamond" w:hAnsi="Garamond" w:cs="Garamond"/>
+          <w:color w:val="000000"/>
+          <w:lang w:val="tr-TR"/>
+        </w:rPr>
+        <w:t xml:space="preserve">i kontrol devresinin beklediği kuru kontak yapısı belirlenecek; mevcut acil durdurma işlevi korunacaktır. Bu </w:t>
       </w:r>
       <w:proofErr w:type="gramStart"/>
       <w:r>
@@ -9114,7 +9522,15 @@
           <w:color w:val="000000"/>
           <w:lang w:val="tr-TR"/>
         </w:rPr>
-        <w:t xml:space="preserve">Bir sonraki somut hedef, mevcut yazılımın tek makine DURDUR butonuyla çalışan LED </w:t>
+        <w:t>Bir sonraki somut hedef, mevcut yazılımın tek makine DURDUR butonuyla çalış</w:t>
+      </w:r>
+      <w:r>
+        <w:rPr>
+          <w:rFonts w:ascii="Garamond" w:hAnsi="Garamond" w:cs="Garamond"/>
+          <w:color w:val="000000"/>
+          <w:lang w:val="tr-TR"/>
+        </w:rPr>
+        <w:t xml:space="preserve">an LED </w:t>
       </w:r>
       <w:proofErr w:type="gramStart"/>
       <w:r>
@@ -9178,6 +9594,13 @@
           <w:lang w:val="tr-TR"/>
         </w:rPr>
         <w:br/>
+      </w:r>
+      <w:r>
+        <w:rPr>
+          <w:rFonts w:ascii="Garamond" w:hAnsi="Garamond" w:cs="Garamond"/>
+          <w:color w:val="000000"/>
+          <w:lang w:val="tr-TR"/>
+        </w:rPr>
         <w:t>Aşağıdaki HTTP yolları konuşmada kaydedildi. Fiziksel test yalnızca IO01 üzerinde tamamlandı.</w:t>
       </w:r>
     </w:p>
@@ -11169,7 +11592,15 @@
           <w:color w:val="000000"/>
           <w:lang w:val="tr-TR"/>
         </w:rPr>
-        <w:t xml:space="preserve"> ölçülerek doğrulanmadığından tablo üretim bağlantı talimatı olarak kullanılmamalıdır. Kanal testleri tek tek tamamlanacaktır.</w:t>
+        <w:t xml:space="preserve"> ölçülerek doğrulanmadığından tablo üretim bağlantı talimatı olarak kullanılmamalıdır. Kanal testleri tek tek </w:t>
+      </w:r>
+      <w:r>
+        <w:rPr>
+          <w:rFonts w:ascii="Garamond" w:hAnsi="Garamond" w:cs="Garamond"/>
+          <w:color w:val="000000"/>
+          <w:lang w:val="tr-TR"/>
+        </w:rPr>
+        <w:t>tamamlanacaktır.</w:t>
       </w:r>
     </w:p>
     <w:p>
@@ -11787,7 +12218,16 @@
           <w:lang w:val="tr-TR"/>
         </w:rPr>
         <w:br/>
-        <w:t>Adres: 192.168.5.190:8080</w:t>
+        <w:t>Adres: 192.168.5.190:</w:t>
+      </w:r>
+      <w:r>
+        <w:rPr>
+          <w:rFonts w:ascii="Consolas" w:hAnsi="Consolas" w:cs="Consolas"/>
+          <w:color w:val="000000"/>
+          <w:sz w:val="19"/>
+          <w:lang w:val="tr-TR"/>
+        </w:rPr>
+        <w:t>8080</w:t>
       </w:r>
       <w:r>
         <w:rPr>
@@ -11937,7 +12377,16 @@
           <w:lang w:val="tr-TR"/>
         </w:rPr>
         <w:br/>
-        <w:t>Yük: Röle 1 COM–NO üzerinden LED modülü</w:t>
+        <w:t>Yük: Röle 1 COM–NO üzeri</w:t>
+      </w:r>
+      <w:r>
+        <w:rPr>
+          <w:rFonts w:ascii="Consolas" w:hAnsi="Consolas" w:cs="Consolas"/>
+          <w:color w:val="000000"/>
+          <w:sz w:val="19"/>
+          <w:lang w:val="tr-TR"/>
+        </w:rPr>
+        <w:t>nden LED modülü</w:t>
       </w:r>
       <w:r>
         <w:rPr>
@@ -11986,7 +12435,15 @@
           <w:color w:val="000000"/>
           <w:lang w:val="tr-TR"/>
         </w:rPr>
-        <w:t xml:space="preserve"> Saha başlıklı 7–11 Eylül 2026 tarihli çalışma konuşması; kullanıcı ölçüm bildirimleri, bağlantı denemeleri ve son test onayları. Konuşma kimliği: 6a9e98bb-5cf0-83eb-a4fb-bcb6296e758a. Ölçümler, öneriler ve henüz uygulanmamış tasarımlar ilgili bölümlerde ayrı gösterilmiştir.</w:t>
+        <w:t xml:space="preserve"> Saha başlıklı 7–11 Eylül 2026 tarihli çalışma konuşması; kullanıcı ölçüm bildirimleri, bağlantı denemeleri ve son test onayları. Konuşma kimliği: 6a9e98bb-5cf0-83eb-a4fb-bcb6296e</w:t>
+      </w:r>
+      <w:r>
+        <w:rPr>
+          <w:rFonts w:ascii="Garamond" w:hAnsi="Garamond" w:cs="Garamond"/>
+          <w:color w:val="000000"/>
+          <w:lang w:val="tr-TR"/>
+        </w:rPr>
+        <w:t>758a. Ölçümler, öneriler ve henüz uygulanmamış tasarımlar ilgili bölümlerde ayrı gösterilmiştir.</w:t>
       </w:r>
     </w:p>
     <w:p>
@@ -12110,7 +12567,15 @@
           <w:color w:val="000000"/>
           <w:lang w:val="tr-TR"/>
         </w:rPr>
-        <w:t xml:space="preserve">11 Eylül’de iş yerindeki bilgisayardan HW-584 yönetim adresinin çalıştığı kullanıcı tarafından bildirildi. Visual </w:t>
+        <w:t xml:space="preserve">11 </w:t>
+      </w:r>
+      <w:r>
+        <w:rPr>
+          <w:rFonts w:ascii="Garamond" w:hAnsi="Garamond" w:cs="Garamond"/>
+          <w:color w:val="000000"/>
+          <w:lang w:val="tr-TR"/>
+        </w:rPr>
+        <w:t xml:space="preserve">Eylül’de iş yerindeki bilgisayardan HW-584 yönetim adresinin çalıştığı kullanıcı tarafından bildirildi. Visual </w:t>
       </w:r>
       <w:proofErr w:type="spellStart"/>
       <w:r>
@@ -12148,7 +12613,15 @@
           <w:color w:val="000000"/>
           <w:lang w:val="tr-TR"/>
         </w:rPr>
-        <w:t>() satırında “Sunucu bulunamadı veya sunucuya erişilemiyor” ve “Sistem belirtilen dosyayı bulamıyor” hatalarıyla karşılaşıldı.</w:t>
+        <w:t>() satırında “Sunucu</w:t>
+      </w:r>
+      <w:r>
+        <w:rPr>
+          <w:rFonts w:ascii="Garamond" w:hAnsi="Garamond" w:cs="Garamond"/>
+          <w:color w:val="000000"/>
+          <w:lang w:val="tr-TR"/>
+        </w:rPr>
+        <w:t xml:space="preserve"> bulunamadı veya sunucuya erişilemiyor” ve “Sistem belirtilen dosyayı bulamıyor” hatalarıyla karşılaşıldı.</w:t>
       </w:r>
     </w:p>
     <w:p>
@@ -12199,7 +12672,15 @@
           <w:color w:val="000000"/>
           <w:lang w:val="tr-TR"/>
         </w:rPr>
-        <w:t xml:space="preserve"> veya dosya yolunun incelenmesi istendi. Kesin düzeltme kaydı paylaşılmadı. Sonraki oturumda </w:t>
+        <w:t xml:space="preserve"> veya dosya yolu</w:t>
+      </w:r>
+      <w:r>
+        <w:rPr>
+          <w:rFonts w:ascii="Garamond" w:hAnsi="Garamond" w:cs="Garamond"/>
+          <w:color w:val="000000"/>
+          <w:lang w:val="tr-TR"/>
+        </w:rPr>
+        <w:t xml:space="preserve">nun incelenmesi istendi. Kesin düzeltme kaydı paylaşılmadı. Sonraki oturumda </w:t>
       </w:r>
       <w:proofErr w:type="spellStart"/>
       <w:r>
@@ -12274,7 +12755,15 @@
           <w:color w:val="000000"/>
           <w:lang w:val="tr-TR"/>
         </w:rPr>
-        <w:t xml:space="preserve"> prosedürünün durumu doğrudan karttan okumadığı netleşti. Prosedür, aktif makineler için </w:t>
+        <w:t xml:space="preserve"> </w:t>
+      </w:r>
+      <w:r>
+        <w:rPr>
+          <w:rFonts w:ascii="Garamond" w:hAnsi="Garamond" w:cs="Garamond"/>
+          <w:color w:val="000000"/>
+          <w:lang w:val="tr-TR"/>
+        </w:rPr>
+        <w:t xml:space="preserve">prosedürünün durumu doğrudan karttan okumadığı netleşti. Prosedür, aktif makineler için </w:t>
       </w:r>
       <w:proofErr w:type="spellStart"/>
       <w:r>
@@ -12328,7 +12817,15 @@
           <w:color w:val="000000"/>
           <w:lang w:val="tr-TR"/>
         </w:rPr>
-        <w:t xml:space="preserve"> değeri, başlangıç tarihinden GETDATE() değerine kadar DATEDIFF(</w:t>
+        <w:t xml:space="preserve"> değeri,</w:t>
+      </w:r>
+      <w:r>
+        <w:rPr>
+          <w:rFonts w:ascii="Garamond" w:hAnsi="Garamond" w:cs="Garamond"/>
+          <w:color w:val="000000"/>
+          <w:lang w:val="tr-TR"/>
+        </w:rPr>
+        <w:t xml:space="preserve"> başlangıç tarihinden GETDATE() değerine kadar DATEDIFF(</w:t>
       </w:r>
       <w:proofErr w:type="gramStart"/>
       <w:r>
@@ -12644,7 +13141,15 @@
           <w:lang w:val="tr-TR"/>
         </w:rPr>
         <w:lastRenderedPageBreak/>
-        <w:t>14 Eylül’de HW-584 IO Control ekranından yapılan değişiklikten sonra Pekin kartı “Duruyor” göstermeye devam etti. Projedeki “Başlat (Röle 1)” düğmesine basılınca kullanıcı ekranın “Çalışıyor” durumuna döndüğünü bildirdi. Yeni tık sesi duyulmadı; ışık zaten yanıyordu. Bu test ekran değişimini doğrular, tek başına yeni bir fiziksel röle hareketini doğrulamaz.</w:t>
+        <w:t>14 Eylül’de HW-584 IO Control ekranından yapılan değişiklikten sonra Pekin kartı “Duruyor” göstermeye devam etti. Projedeki “Başlat (Röle 1)” düğmesine basılınca kullanıcı ekranın “Çalışıyor” durumuna döndüğünü bildirdi. Yeni tık sesi duyulmadı; ışık zaten</w:t>
+      </w:r>
+      <w:r>
+        <w:rPr>
+          <w:rFonts w:ascii="Garamond" w:hAnsi="Garamond" w:cs="Garamond"/>
+          <w:color w:val="000000"/>
+          <w:lang w:val="tr-TR"/>
+        </w:rPr>
+        <w:t xml:space="preserve"> yanıyordu. Bu test ekran değişimini doğrular, tek başına yeni bir fiziksel röle hareketini doğrulamaz.</w:t>
       </w:r>
     </w:p>
     <w:p>
@@ -12794,7 +13299,16 @@
                 <w:sz w:val="22"/>
                 <w:lang w:val="tr-TR"/>
               </w:rPr>
-              <w:t>IO01 ON; diğerleri OFF</w:t>
+              <w:t>IO</w:t>
+            </w:r>
+            <w:r>
+              <w:rPr>
+                <w:rFonts w:ascii="Garamond" w:hAnsi="Garamond" w:cs="Garamond"/>
+                <w:color w:val="000000"/>
+                <w:sz w:val="22"/>
+                <w:lang w:val="tr-TR"/>
+              </w:rPr>
+              <w:t>01 ON; diğerleri OFF</w:t>
             </w:r>
           </w:p>
         </w:tc>
@@ -12954,7 +13468,15 @@
           <w:color w:val="000000"/>
           <w:lang w:val="tr-TR"/>
         </w:rPr>
-        <w:t xml:space="preserve"> = 16 − n şeklindedir. IO02 bitinin okunması, IO02 fiziksel </w:t>
+        <w:t xml:space="preserve"> = 16 − n şe</w:t>
+      </w:r>
+      <w:r>
+        <w:rPr>
+          <w:rFonts w:ascii="Garamond" w:hAnsi="Garamond" w:cs="Garamond"/>
+          <w:color w:val="000000"/>
+          <w:lang w:val="tr-TR"/>
+        </w:rPr>
+        <w:t xml:space="preserve">klindedir. IO02 bitinin okunması, IO02 fiziksel </w:t>
       </w:r>
       <w:proofErr w:type="spellStart"/>
       <w:r>
@@ -13049,7 +13571,15 @@
           <w:color w:val="000000"/>
           <w:lang w:val="tr-TR"/>
         </w:rPr>
-        <w:t xml:space="preserve"> AJAX/</w:t>
+        <w:t xml:space="preserve"> AJ</w:t>
+      </w:r>
+      <w:r>
+        <w:rPr>
+          <w:rFonts w:ascii="Garamond" w:hAnsi="Garamond" w:cs="Garamond"/>
+          <w:color w:val="000000"/>
+          <w:lang w:val="tr-TR"/>
+        </w:rPr>
+        <w:t>AX/</w:t>
       </w:r>
       <w:proofErr w:type="spellStart"/>
       <w:r>
@@ -13098,7 +13628,15 @@
           <w:color w:val="000000"/>
           <w:lang w:val="tr-TR"/>
         </w:rPr>
-        <w:t xml:space="preserve">Taslak; donanım biti ile aktif DURDUR kaydını karşılaştırmayı, gerekli durumda kayıt açmayı veya </w:t>
+        <w:t>Taslak; donanı</w:t>
+      </w:r>
+      <w:r>
+        <w:rPr>
+          <w:rFonts w:ascii="Garamond" w:hAnsi="Garamond" w:cs="Garamond"/>
+          <w:color w:val="000000"/>
+          <w:lang w:val="tr-TR"/>
+        </w:rPr>
+        <w:t xml:space="preserve">m biti ile aktif DURDUR kaydını karşılaştırmayı, gerekli durumda kayıt açmayı veya </w:t>
       </w:r>
       <w:proofErr w:type="spellStart"/>
       <w:r>
@@ -13198,7 +13736,15 @@
           <w:color w:val="000000"/>
           <w:lang w:val="tr-TR"/>
         </w:rPr>
-        <w:t xml:space="preserve"> kolonu ve örnek makine kimlikleri öneri niteliğindeydi; gerçek </w:t>
+        <w:t xml:space="preserve"> kolonu ve örnek maki</w:t>
+      </w:r>
+      <w:r>
+        <w:rPr>
+          <w:rFonts w:ascii="Garamond" w:hAnsi="Garamond" w:cs="Garamond"/>
+          <w:color w:val="000000"/>
+          <w:lang w:val="tr-TR"/>
+        </w:rPr>
+        <w:t xml:space="preserve">ne kimlikleri öneri niteliğindeydi; gerçek </w:t>
       </w:r>
       <w:proofErr w:type="spellStart"/>
       <w:r>
@@ -13263,7 +13809,15 @@
           <w:color w:val="000000"/>
           <w:lang w:val="tr-TR"/>
         </w:rPr>
-        <w:t xml:space="preserve">Bu yeni okuma, HW-584 IO seviyesini bildirir. Mekanik kontağın gerçekten hareket ettiğini veya makinenin fiilen durduğunu bağımsız olarak ölçmez. Konuşmadaki “1 = duruyor, 0 = çalışıyor” </w:t>
+        <w:t>Bu yeni okuma, HW-584 IO seviyesini bildirir. Mekanik kont</w:t>
+      </w:r>
+      <w:r>
+        <w:rPr>
+          <w:rFonts w:ascii="Garamond" w:hAnsi="Garamond" w:cs="Garamond"/>
+          <w:color w:val="000000"/>
+          <w:lang w:val="tr-TR"/>
+        </w:rPr>
+        <w:t xml:space="preserve">ağın gerçekten hareket ettiğini veya makinenin fiilen durduğunu bağımsız olarak ölçmez. Konuşmadaki “1 = duruyor, 0 = çalışıyor” </w:t>
       </w:r>
       <w:r>
         <w:rPr>
@@ -13272,7 +13826,15 @@
           <w:lang w:val="tr-TR"/>
         </w:rPr>
         <w:lastRenderedPageBreak/>
-        <w:t>yorumu kontrol senaryosunun eşlemesidir. Özellikle gerçek makineye geçişte, bu bit tek başına başarılı fiziksel duruş kaydı sayılmamalıdır.</w:t>
+        <w:t>yorumu kontrol senaryosunun eşlemesidir. Özellikle gerçek makineye geçişte, bu bit tek başına başarılı fiziksel duruş kaydı say</w:t>
+      </w:r>
+      <w:r>
+        <w:rPr>
+          <w:rFonts w:ascii="Garamond" w:hAnsi="Garamond" w:cs="Garamond"/>
+          <w:color w:val="000000"/>
+          <w:lang w:val="tr-TR"/>
+        </w:rPr>
+        <w:t>ılmamalıdır.</w:t>
       </w:r>
     </w:p>
     <w:p>
@@ -13309,7 +13871,15 @@
           <w:color w:val="000000"/>
           <w:lang w:val="tr-TR"/>
         </w:rPr>
-        <w:t>14 Eylül’de hedef makinenin üst çardak mekanizması yakından incelendi. Kullanıcı, ince metal parçaların hata konumuna gelmesiyle makinenin üst çardak hatası verdiğini anlattı. Yeni yaklaşım, bu temas davranışını röle kontağıyla taklit ederek durdurma talebi oluşturmaktır.</w:t>
+        <w:t>14 Eylül’de hedef makinenin üst çardak mekanizması yakından incelendi. Kullanıcı, ince metal parçaların hata konumuna gelmesiyle makinenin üst çardak hatası verdiğini anlattı. Yeni yaklaşım, bu temas davranışını röle kontağıyla taklit ederek durdurma taleb</w:t>
+      </w:r>
+      <w:r>
+        <w:rPr>
+          <w:rFonts w:ascii="Garamond" w:hAnsi="Garamond" w:cs="Garamond"/>
+          <w:color w:val="000000"/>
+          <w:lang w:val="tr-TR"/>
+        </w:rPr>
+        <w:t>i oluşturmaktır.</w:t>
       </w:r>
     </w:p>
     <w:p>
@@ -13322,7 +13892,15 @@
           <w:color w:val="000000"/>
           <w:lang w:val="tr-TR"/>
         </w:rPr>
-        <w:t>Aynı hatta birden fazla çardak bulunduğu belirtildi. Ortak hatların ve makine elektroniğinin ölçümleri etkileyebileceği konuşuldu; seri/paralel yapı kesinleşmedi. Başlangıçta 1–3 çifti aday olarak düşünüldü. İki damarlı kablo ve geçici temas yöntemleri görüşüldü; kullanıcı ilk denemenin sonuç vermediğini bildirdi. Elektrik bandının elektriksel temasın kendisini sağlamadığı, yalnızca tutma/</w:t>
+        <w:t>Aynı hatta birden fazla çardak bulunduğu belirtildi. Ortak hatların ve makine elektroniğinin ölçümleri etkileyebileceği konuşuldu; seri/paralel yapı kesinleşmedi. Başlangıçta 1–3 çifti aday olarak düşünüldü. İki damarlı kablo ve geçici tem</w:t>
+      </w:r>
+      <w:r>
+        <w:rPr>
+          <w:rFonts w:ascii="Garamond" w:hAnsi="Garamond" w:cs="Garamond"/>
+          <w:color w:val="000000"/>
+          <w:lang w:val="tr-TR"/>
+        </w:rPr>
+        <w:t>as yöntemleri görüşüldü; kullanıcı ilk denemenin sonuç vermediğini bildirdi. Elektrik bandının elektriksel temasın kendisini sağlamadığı, yalnızca tutma/</w:t>
       </w:r>
       <w:proofErr w:type="gramStart"/>
       <w:r>
@@ -13916,7 +14494,17 @@
           <w:sz w:val="25"/>
           <w:lang w:val="tr-TR"/>
         </w:rPr>
-        <w:t>Sonraki belirleyici gözlem</w:t>
+        <w:t>Sonraki be</w:t>
+      </w:r>
+      <w:r>
+        <w:rPr>
+          <w:rFonts w:ascii="Garamond" w:hAnsi="Garamond" w:cs="Garamond"/>
+          <w:b/>
+          <w:color w:val="000000"/>
+          <w:sz w:val="25"/>
+          <w:lang w:val="tr-TR"/>
+        </w:rPr>
+        <w:t>lirleyici gözlem</w:t>
       </w:r>
     </w:p>
     <w:p>
@@ -13929,7 +14517,15 @@
           <w:color w:val="000000"/>
           <w:lang w:val="tr-TR"/>
         </w:rPr>
-        <w:t>Ölçüm tablosundaki değişim nedeniyle önce 3–4 çifti yeni aday olarak yorumlandı; bu yorum henüz doğrulanmış bağlantı değildi. Kullanıcı sonraki denemede “Buldum 2 ile 4 oldu makina uyarı verdi” bilgisini paylaştı. Böylece uyarı oluşturan temas çifti olarak 2–4 kaydedildi; önceki 1–3 ve 3–4 adayları son bağlantı planının temeli olmaktan çıktı.</w:t>
+        <w:t>Ölçüm tablosundaki değişim nedeniyle önce 3–4 çifti yeni aday olarak yorumlandı; bu yorum henüz doğrulanmış bağlantı değildi. Kullanıcı sonraki denemede “Buldum 2 ile 4 oldu makina uyarı verdi” bilgisini paylaştı. Böylece uyarı oluşturan t</w:t>
+      </w:r>
+      <w:r>
+        <w:rPr>
+          <w:rFonts w:ascii="Garamond" w:hAnsi="Garamond" w:cs="Garamond"/>
+          <w:color w:val="000000"/>
+          <w:lang w:val="tr-TR"/>
+        </w:rPr>
+        <w:t>emas çifti olarak 2–4 kaydedildi; önceki 1–3 ve 3–4 adayları son bağlantı planının temeli olmaktan çıktı.</w:t>
       </w:r>
     </w:p>
     <w:p>
@@ -13943,7 +14539,15 @@
           <w:lang w:val="tr-TR"/>
         </w:rPr>
         <w:lastRenderedPageBreak/>
-        <w:t>Kullanıcı bildirimi makinenin uyarı verdiğini açıkça doğruluyor. Makinenin o sırada hareket halinde olduğu, fiziksel olarak durduğu veya bu işlemin yazılım ve röle üzerinden yapıldığı ayrıca bildirilmedi. Sonuç bu kapsamla sınırlıdır. 1–4 numaraları saha denemesindeki yerel numaralandırmadır; üretici terminal numarası olarak doğrulanmadı.</w:t>
+        <w:t>Kullanıcı bildirimi makinenin uyarı verdiğini açıkça doğruluyor. Makinenin o sırada hareket halinde olduğu, fiziksel olarak durduğu veya bu işlemin ya</w:t>
+      </w:r>
+      <w:r>
+        <w:rPr>
+          <w:rFonts w:ascii="Garamond" w:hAnsi="Garamond" w:cs="Garamond"/>
+          <w:color w:val="000000"/>
+          <w:lang w:val="tr-TR"/>
+        </w:rPr>
+        <w:t>zılım ve röle üzerinden yapıldığı ayrıca bildirilmedi. Sonuç bu kapsamla sınırlıdır. 1–4 numaraları saha denemesindeki yerel numaralandırmadır; üretici terminal numarası olarak doğrulanmadı.</w:t>
       </w:r>
     </w:p>
     <w:p>
@@ -13980,7 +14584,15 @@
           <w:color w:val="000000"/>
           <w:lang w:val="tr-TR"/>
         </w:rPr>
-        <w:t xml:space="preserve">2–4 denemesinden sonra konuşmada, mevcut komut eşlemesini koruyan COM–NC çıkış planı oluşturuldu. Bu plan, önceki LED </w:t>
+        <w:t xml:space="preserve">2–4 denemesinden sonra </w:t>
+      </w:r>
+      <w:r>
+        <w:rPr>
+          <w:rFonts w:ascii="Garamond" w:hAnsi="Garamond" w:cs="Garamond"/>
+          <w:color w:val="000000"/>
+          <w:lang w:val="tr-TR"/>
+        </w:rPr>
+        <w:t xml:space="preserve">konuşmada, mevcut komut eşlemesini koruyan COM–NC çıkış planı oluşturuldu. Bu plan, önceki LED </w:t>
       </w:r>
       <w:proofErr w:type="gramStart"/>
       <w:r>
@@ -14396,7 +15008,15 @@
           <w:color w:val="000000"/>
           <w:lang w:val="tr-TR"/>
         </w:rPr>
-        <w:t xml:space="preserve"> DC+, DC− veya HW beslemesi taşınmayacaktır. Makine hattının çalışma gerilimi ve röle kontağına uygunluğu henüz ölçümle belgelenmedi.</w:t>
+        <w:t xml:space="preserve"> DC+, DC− veya HW beslemesi taşınmayacaktır. Makine hattının çalışma gerilimi ve röle kontağına uy</w:t>
+      </w:r>
+      <w:r>
+        <w:rPr>
+          <w:rFonts w:ascii="Garamond" w:hAnsi="Garamond" w:cs="Garamond"/>
+          <w:color w:val="000000"/>
+          <w:lang w:val="tr-TR"/>
+        </w:rPr>
+        <w:t>gunluğu henüz ölçümle belgelenmedi.</w:t>
       </w:r>
     </w:p>
     <w:p>
@@ -14461,7 +15081,17 @@
           <w:sz w:val="25"/>
           <w:lang w:val="tr-TR"/>
         </w:rPr>
-        <w:t>15 Eylül itibarıyla tamamlanan ve kalan işler</w:t>
+        <w:t>15 Eylül it</w:t>
+      </w:r>
+      <w:r>
+        <w:rPr>
+          <w:rFonts w:ascii="Garamond" w:hAnsi="Garamond" w:cs="Garamond"/>
+          <w:b/>
+          <w:color w:val="000000"/>
+          <w:sz w:val="25"/>
+          <w:lang w:val="tr-TR"/>
+        </w:rPr>
+        <w:t>ibarıyla tamamlanan ve kalan işler</w:t>
       </w:r>
     </w:p>
     <w:tbl>
@@ -14843,7 +15473,15 @@
           <w:color w:val="000000"/>
           <w:lang w:val="tr-TR"/>
         </w:rPr>
-        <w:t xml:space="preserve">Sıradaki doğrulama; 2–4 hatlarının elektriksel uygunluğunun belirlenmesi, planlanan kuru kontak bağlantısının kontrollü denenmesi ve yazılım komutu, röle tepkisi, makine uyarısı ile gerçek duruşun birlikte kaydedilmesidir. Kaynak: </w:t>
+        <w:t>Sıradaki doğrulama; 2–4 hatlarının elektriksel uygunluğunun belirlenmesi, planlanan kuru kontak bağlantısının ko</w:t>
+      </w:r>
+      <w:r>
+        <w:rPr>
+          <w:rFonts w:ascii="Garamond" w:hAnsi="Garamond" w:cs="Garamond"/>
+          <w:color w:val="000000"/>
+          <w:lang w:val="tr-TR"/>
+        </w:rPr>
+        <w:t xml:space="preserve">ntrollü denenmesi ve yazılım komutu, röle tepkisi, makine uyarısı ile gerçek duruşun birlikte kaydedilmesidir. Kaynak: </w:t>
       </w:r>
       <w:proofErr w:type="spellStart"/>
       <w:r>
@@ -14862,6 +15500,1166 @@
           <w:lang w:val="tr-TR"/>
         </w:rPr>
         <w:t xml:space="preserve"> Saha, ilk rapor sonrasındaki 11 ve 14 Eylül 2026 mesajları.</w:t>
+      </w:r>
+    </w:p>
+    <w:p>
+      <w:pPr>
+        <w:pageBreakBefore/>
+        <w:spacing w:after="120" w:line="260" w:lineRule="auto"/>
+      </w:pPr>
+    </w:p>
+    <w:p>
+      <w:pPr>
+        <w:pStyle w:val="Balk1"/>
+        <w:spacing w:before="160" w:after="120" w:line="260" w:lineRule="auto"/>
+        <w:jc w:val="center"/>
+      </w:pPr>
+      <w:r>
+        <w:rPr>
+          <w:rFonts w:ascii="Garamond" w:hAnsi="Garamond" w:cs="Garamond"/>
+          <w:b/>
+          <w:color w:val="000000"/>
+          <w:sz w:val="28"/>
+          <w:u w:val="single"/>
+          <w:lang w:val="tr-TR"/>
+        </w:rPr>
+        <w:t>Ek D Gerçek makine ve uzun kablo testleri</w:t>
+      </w:r>
+    </w:p>
+    <w:p>
+      <w:pPr>
+        <w:spacing w:after="120" w:line="360" w:lineRule="auto"/>
+      </w:pPr>
+      <w:r>
+        <w:rPr>
+          <w:rFonts w:ascii="Garamond" w:hAnsi="Garamond" w:cs="Garamond"/>
+          <w:color w:val="000000"/>
+          <w:lang w:val="tr-TR"/>
+        </w:rPr>
+        <w:t>Saha kayıt tarihi: 1</w:t>
+      </w:r>
+      <w:r>
+        <w:rPr>
+          <w:rFonts w:ascii="Garamond" w:hAnsi="Garamond" w:cs="Garamond"/>
+          <w:color w:val="000000"/>
+          <w:lang w:val="tr-TR"/>
+        </w:rPr>
+        <w:t>5 Eylül 2026</w:t>
+      </w:r>
+      <w:r>
+        <w:rPr>
+          <w:rFonts w:ascii="Garamond" w:hAnsi="Garamond" w:cs="Garamond"/>
+          <w:color w:val="000000"/>
+          <w:lang w:val="tr-TR"/>
+        </w:rPr>
+        <w:br/>
+        <w:t>Bu bölüm, Ek C sonrasındaki yeni gelişmeleri içerir. Önceki bölümlerdeki durum kayıtlarının devamıdır.</w:t>
+      </w:r>
+    </w:p>
+    <w:p>
+      <w:pPr>
+        <w:pStyle w:val="Balk2"/>
+        <w:spacing w:after="120" w:line="260" w:lineRule="auto"/>
+      </w:pPr>
+      <w:r>
+        <w:rPr>
+          <w:rFonts w:ascii="Garamond" w:hAnsi="Garamond" w:cs="Garamond"/>
+          <w:b/>
+          <w:color w:val="000000"/>
+          <w:sz w:val="25"/>
+          <w:lang w:val="tr-TR"/>
+        </w:rPr>
+        <w:t>D1 Şirket ağı üzerinden uzaktan erişim</w:t>
+      </w:r>
+    </w:p>
+    <w:p>
+      <w:pPr>
+        <w:spacing w:after="120" w:line="360" w:lineRule="auto"/>
+      </w:pPr>
+      <w:r>
+        <w:rPr>
+          <w:rFonts w:ascii="Garamond" w:hAnsi="Garamond" w:cs="Garamond"/>
+          <w:color w:val="000000"/>
+          <w:lang w:val="tr-TR"/>
+        </w:rPr>
+        <w:t xml:space="preserve">PC ile cihazın birbirinden uzak olması nedeniyle HW-584 şirket ağına bağlandı. Kullanıcı, cihazın yanında bulunmadığını ve PC ile cihaz arasında doğrudan Ethernet kablosu olmadığını belirtti. Paylaşılan </w:t>
+      </w:r>
+      <w:proofErr w:type="spellStart"/>
+      <w:r>
+        <w:rPr>
+          <w:rFonts w:ascii="Garamond" w:hAnsi="Garamond" w:cs="Garamond"/>
+          <w:color w:val="000000"/>
+          <w:lang w:val="tr-TR"/>
+        </w:rPr>
+        <w:t>ping</w:t>
+      </w:r>
+      <w:proofErr w:type="spellEnd"/>
+      <w:r>
+        <w:rPr>
+          <w:rFonts w:ascii="Garamond" w:hAnsi="Garamond" w:cs="Garamond"/>
+          <w:color w:val="000000"/>
+          <w:lang w:val="tr-TR"/>
+        </w:rPr>
+        <w:t xml:space="preserve"> ekranı konuşmada dört paketten üçünün yanıtlandı</w:t>
+      </w:r>
+      <w:r>
+        <w:rPr>
+          <w:rFonts w:ascii="Garamond" w:hAnsi="Garamond" w:cs="Garamond"/>
+          <w:color w:val="000000"/>
+          <w:lang w:val="tr-TR"/>
+        </w:rPr>
+        <w:t xml:space="preserve">ğı, birinin zaman aşımına uğradığı ve yaklaşık 3 </w:t>
+      </w:r>
+      <w:proofErr w:type="spellStart"/>
+      <w:r>
+        <w:rPr>
+          <w:rFonts w:ascii="Garamond" w:hAnsi="Garamond" w:cs="Garamond"/>
+          <w:color w:val="000000"/>
+          <w:lang w:val="tr-TR"/>
+        </w:rPr>
+        <w:t>ms</w:t>
+      </w:r>
+      <w:proofErr w:type="spellEnd"/>
+      <w:r>
+        <w:rPr>
+          <w:rFonts w:ascii="Garamond" w:hAnsi="Garamond" w:cs="Garamond"/>
+          <w:color w:val="000000"/>
+          <w:lang w:val="tr-TR"/>
+        </w:rPr>
+        <w:t xml:space="preserve"> gecikme görüldüğü şeklinde değerlendirildi. Ardından kullanıcı yönetim panelinin açıldığını doğruladı. Böylece önceki raporda bekleyen şirket ağı üzerinden erişim denemesi yapılmış oldu.</w:t>
+      </w:r>
+    </w:p>
+    <w:p>
+      <w:pPr>
+        <w:spacing w:after="120" w:line="360" w:lineRule="auto"/>
+      </w:pPr>
+      <w:r>
+        <w:rPr>
+          <w:rFonts w:ascii="Garamond" w:hAnsi="Garamond" w:cs="Garamond"/>
+          <w:color w:val="000000"/>
+          <w:lang w:val="tr-TR"/>
+        </w:rPr>
+        <w:t>Aynı gün daha son</w:t>
+      </w:r>
+      <w:r>
+        <w:rPr>
+          <w:rFonts w:ascii="Garamond" w:hAnsi="Garamond" w:cs="Garamond"/>
+          <w:color w:val="000000"/>
+          <w:lang w:val="tr-TR"/>
+        </w:rPr>
+        <w:t xml:space="preserve">raki bir denemede </w:t>
+      </w:r>
+      <w:proofErr w:type="spellStart"/>
+      <w:r>
+        <w:rPr>
+          <w:rFonts w:ascii="Garamond" w:hAnsi="Garamond" w:cs="Garamond"/>
+          <w:color w:val="000000"/>
+          <w:lang w:val="tr-TR"/>
+        </w:rPr>
+        <w:t>Request</w:t>
+      </w:r>
+      <w:proofErr w:type="spellEnd"/>
+      <w:r>
+        <w:rPr>
+          <w:rFonts w:ascii="Garamond" w:hAnsi="Garamond" w:cs="Garamond"/>
+          <w:color w:val="000000"/>
+          <w:lang w:val="tr-TR"/>
+        </w:rPr>
+        <w:t xml:space="preserve"> </w:t>
+      </w:r>
+      <w:proofErr w:type="spellStart"/>
+      <w:r>
+        <w:rPr>
+          <w:rFonts w:ascii="Garamond" w:hAnsi="Garamond" w:cs="Garamond"/>
+          <w:color w:val="000000"/>
+          <w:lang w:val="tr-TR"/>
+        </w:rPr>
+        <w:t>timed</w:t>
+      </w:r>
+      <w:proofErr w:type="spellEnd"/>
+      <w:r>
+        <w:rPr>
+          <w:rFonts w:ascii="Garamond" w:hAnsi="Garamond" w:cs="Garamond"/>
+          <w:color w:val="000000"/>
+          <w:lang w:val="tr-TR"/>
+        </w:rPr>
+        <w:t xml:space="preserve"> </w:t>
+      </w:r>
+      <w:proofErr w:type="spellStart"/>
+      <w:r>
+        <w:rPr>
+          <w:rFonts w:ascii="Garamond" w:hAnsi="Garamond" w:cs="Garamond"/>
+          <w:color w:val="000000"/>
+          <w:lang w:val="tr-TR"/>
+        </w:rPr>
+        <w:t>out</w:t>
+      </w:r>
+      <w:proofErr w:type="spellEnd"/>
+      <w:r>
+        <w:rPr>
+          <w:rFonts w:ascii="Garamond" w:hAnsi="Garamond" w:cs="Garamond"/>
+          <w:color w:val="000000"/>
+          <w:lang w:val="tr-TR"/>
+        </w:rPr>
+        <w:t xml:space="preserve"> ve 192.168.5.183 kaynaklı </w:t>
+      </w:r>
+      <w:proofErr w:type="spellStart"/>
+      <w:r>
+        <w:rPr>
+          <w:rFonts w:ascii="Garamond" w:hAnsi="Garamond" w:cs="Garamond"/>
+          <w:color w:val="000000"/>
+          <w:lang w:val="tr-TR"/>
+        </w:rPr>
+        <w:t>Destination</w:t>
+      </w:r>
+      <w:proofErr w:type="spellEnd"/>
+      <w:r>
+        <w:rPr>
+          <w:rFonts w:ascii="Garamond" w:hAnsi="Garamond" w:cs="Garamond"/>
+          <w:color w:val="000000"/>
+          <w:lang w:val="tr-TR"/>
+        </w:rPr>
+        <w:t xml:space="preserve"> </w:t>
+      </w:r>
+      <w:proofErr w:type="spellStart"/>
+      <w:r>
+        <w:rPr>
+          <w:rFonts w:ascii="Garamond" w:hAnsi="Garamond" w:cs="Garamond"/>
+          <w:color w:val="000000"/>
+          <w:lang w:val="tr-TR"/>
+        </w:rPr>
+        <w:t>host</w:t>
+      </w:r>
+      <w:proofErr w:type="spellEnd"/>
+      <w:r>
+        <w:rPr>
+          <w:rFonts w:ascii="Garamond" w:hAnsi="Garamond" w:cs="Garamond"/>
+          <w:color w:val="000000"/>
+          <w:lang w:val="tr-TR"/>
+        </w:rPr>
+        <w:t xml:space="preserve"> </w:t>
+      </w:r>
+      <w:proofErr w:type="spellStart"/>
+      <w:r>
+        <w:rPr>
+          <w:rFonts w:ascii="Garamond" w:hAnsi="Garamond" w:cs="Garamond"/>
+          <w:color w:val="000000"/>
+          <w:lang w:val="tr-TR"/>
+        </w:rPr>
+        <w:t>unreachable</w:t>
+      </w:r>
+      <w:proofErr w:type="spellEnd"/>
+      <w:r>
+        <w:rPr>
+          <w:rFonts w:ascii="Garamond" w:hAnsi="Garamond" w:cs="Garamond"/>
+          <w:color w:val="000000"/>
+          <w:lang w:val="tr-TR"/>
+        </w:rPr>
+        <w:t xml:space="preserve"> sonuçları görüldü. Kullanıcı güç/Ethernet göstergelerinin yandığını ve ARP </w:t>
+      </w:r>
+      <w:proofErr w:type="gramStart"/>
+      <w:r>
+        <w:rPr>
+          <w:rFonts w:ascii="Garamond" w:hAnsi="Garamond" w:cs="Garamond"/>
+          <w:color w:val="000000"/>
+          <w:lang w:val="tr-TR"/>
+        </w:rPr>
+        <w:t>tablosunda .190</w:t>
+      </w:r>
+      <w:proofErr w:type="gramEnd"/>
+      <w:r>
+        <w:rPr>
+          <w:rFonts w:ascii="Garamond" w:hAnsi="Garamond" w:cs="Garamond"/>
+          <w:color w:val="000000"/>
+          <w:lang w:val="tr-TR"/>
+        </w:rPr>
+        <w:t xml:space="preserve"> kaydı bulunmadığını bildirdi. Ağ geçidine </w:t>
+      </w:r>
+      <w:proofErr w:type="spellStart"/>
+      <w:r>
+        <w:rPr>
+          <w:rFonts w:ascii="Garamond" w:hAnsi="Garamond" w:cs="Garamond"/>
+          <w:color w:val="000000"/>
+          <w:lang w:val="tr-TR"/>
+        </w:rPr>
+        <w:t>ping</w:t>
+      </w:r>
+      <w:proofErr w:type="spellEnd"/>
+      <w:r>
+        <w:rPr>
+          <w:rFonts w:ascii="Garamond" w:hAnsi="Garamond" w:cs="Garamond"/>
+          <w:color w:val="000000"/>
+          <w:lang w:val="tr-TR"/>
+        </w:rPr>
+        <w:t xml:space="preserve"> testi önerildi; bu testin s</w:t>
+      </w:r>
+      <w:r>
+        <w:rPr>
+          <w:rFonts w:ascii="Garamond" w:hAnsi="Garamond" w:cs="Garamond"/>
+          <w:color w:val="000000"/>
+          <w:lang w:val="tr-TR"/>
+        </w:rPr>
+        <w:t>onucu ve erişim sorununun kesin çözümü paylaşılmadı. İlk erişim başarısı, kalıcı ağ kararlılığının doğrulandığı anlamına gelmez.</w:t>
+      </w:r>
+    </w:p>
+    <w:p>
+      <w:pPr>
+        <w:pStyle w:val="Balk2"/>
+        <w:spacing w:after="120" w:line="260" w:lineRule="auto"/>
+      </w:pPr>
+      <w:r>
+        <w:rPr>
+          <w:rFonts w:ascii="Garamond" w:hAnsi="Garamond" w:cs="Garamond"/>
+          <w:b/>
+          <w:color w:val="000000"/>
+          <w:sz w:val="25"/>
+          <w:lang w:val="tr-TR"/>
+        </w:rPr>
+        <w:t>D2 LED devresinden gerçek makine bağlantısına geçiş</w:t>
+      </w:r>
+    </w:p>
+    <w:p>
+      <w:pPr>
+        <w:spacing w:after="120" w:line="360" w:lineRule="auto"/>
+      </w:pPr>
+      <w:r>
+        <w:rPr>
+          <w:rFonts w:ascii="Garamond" w:hAnsi="Garamond" w:cs="Garamond"/>
+          <w:color w:val="000000"/>
+          <w:lang w:val="tr-TR"/>
+        </w:rPr>
+        <w:t>Kullanıcı röledeki LED’in çıkarılmasını istedi. LED’in NO ve DC− bağlantıla</w:t>
+      </w:r>
+      <w:r>
+        <w:rPr>
+          <w:rFonts w:ascii="Garamond" w:hAnsi="Garamond" w:cs="Garamond"/>
+          <w:color w:val="000000"/>
+          <w:lang w:val="tr-TR"/>
+        </w:rPr>
+        <w:t>rı ile LED için eklenen DC+ → COM köprüsünün kaldırılması tarif edildi; kullanıcı “tamamdır” yanıtını verdi. Bu işlem, Ek C’de plan olarak duran LED devresini kaldırma adımının yeni durum kaydıdır.</w:t>
+      </w:r>
+    </w:p>
+    <w:p>
+      <w:pPr>
+        <w:spacing w:after="120" w:line="360" w:lineRule="auto"/>
+      </w:pPr>
+      <w:r>
+        <w:rPr>
+          <w:rFonts w:ascii="Garamond" w:hAnsi="Garamond" w:cs="Garamond"/>
+          <w:color w:val="000000"/>
+          <w:lang w:val="tr-TR"/>
+        </w:rPr>
+        <w:t>Makine ile rölenin kuru kontağı arasındaki hat için fotoğr</w:t>
+      </w:r>
+      <w:r>
+        <w:rPr>
+          <w:rFonts w:ascii="Garamond" w:hAnsi="Garamond" w:cs="Garamond"/>
+          <w:color w:val="000000"/>
+          <w:lang w:val="tr-TR"/>
+        </w:rPr>
+        <w:t>afta 2 × 0,75 mm² olarak okunan iki damarlı kablo ele alındı. Kullanıcı mesafeyi yaklaşık 15–20 metre olarak belirtti ve uzun kabloyla deneme yaptığını daha sonra doğruladı. Buradaki mesafe Ethernet hattına değil, makine temasları ile röle kontağı arasında</w:t>
+      </w:r>
+      <w:r>
+        <w:rPr>
+          <w:rFonts w:ascii="Garamond" w:hAnsi="Garamond" w:cs="Garamond"/>
+          <w:color w:val="000000"/>
+          <w:lang w:val="tr-TR"/>
+        </w:rPr>
+        <w:t>ki kabloya aittir.</w:t>
+      </w:r>
+    </w:p>
+    <w:p>
+      <w:pPr>
+        <w:pStyle w:val="Balk2"/>
+        <w:spacing w:after="120" w:line="260" w:lineRule="auto"/>
+      </w:pPr>
+      <w:r>
+        <w:rPr>
+          <w:rFonts w:ascii="Garamond" w:hAnsi="Garamond" w:cs="Garamond"/>
+          <w:b/>
+          <w:color w:val="000000"/>
+          <w:sz w:val="25"/>
+          <w:lang w:val="tr-TR"/>
+        </w:rPr>
+        <w:t>D3 İlk gerçek duruş ve tekrarda başarısızlık</w:t>
+      </w:r>
+    </w:p>
+    <w:p>
+      <w:pPr>
+        <w:spacing w:after="120" w:line="360" w:lineRule="auto"/>
+      </w:pPr>
+      <w:r>
+        <w:rPr>
+          <w:rFonts w:ascii="Garamond" w:hAnsi="Garamond" w:cs="Garamond"/>
+          <w:color w:val="000000"/>
+          <w:lang w:val="tr-TR"/>
+        </w:rPr>
+        <w:t xml:space="preserve">Kullanıcı “makina on </w:t>
+      </w:r>
+      <w:proofErr w:type="spellStart"/>
+      <w:r>
+        <w:rPr>
+          <w:rFonts w:ascii="Garamond" w:hAnsi="Garamond" w:cs="Garamond"/>
+          <w:color w:val="000000"/>
+          <w:lang w:val="tr-TR"/>
+        </w:rPr>
+        <w:t>ken</w:t>
+      </w:r>
+      <w:proofErr w:type="spellEnd"/>
+      <w:r>
+        <w:rPr>
+          <w:rFonts w:ascii="Garamond" w:hAnsi="Garamond" w:cs="Garamond"/>
+          <w:color w:val="000000"/>
+          <w:lang w:val="tr-TR"/>
+        </w:rPr>
+        <w:t xml:space="preserve"> hata verdi ve durdu” bilgisini paylaştı. Bu, Ek C’de yalnızca uyarı alınmış olarak kayıtlı aşamadan ileridir: IO ON durumunda gerçek makine duruşu da açıkça bildirilmi</w:t>
+      </w:r>
+      <w:r>
+        <w:rPr>
+          <w:rFonts w:ascii="Garamond" w:hAnsi="Garamond" w:cs="Garamond"/>
+          <w:color w:val="000000"/>
+          <w:lang w:val="tr-TR"/>
+        </w:rPr>
+        <w:t xml:space="preserve">ştir. Daha sonra “uzun kablo ile yapınca makine hata verdi ama sonrasında tekrar denedim vermedi” </w:t>
+      </w:r>
+      <w:r>
+        <w:rPr>
+          <w:rFonts w:ascii="Garamond" w:hAnsi="Garamond" w:cs="Garamond"/>
+          <w:color w:val="000000"/>
+          <w:lang w:val="tr-TR"/>
+        </w:rPr>
+        <w:lastRenderedPageBreak/>
+        <w:t>açıklaması geldi. Dolayısıyla ilk başarılı sonuç elde edilmiş, fakat tekrarlanabilir çalışma henüz sağlanmamıştır.</w:t>
+      </w:r>
+    </w:p>
+    <w:p>
+      <w:pPr>
+        <w:spacing w:after="120" w:line="360" w:lineRule="auto"/>
+      </w:pPr>
+      <w:r>
+        <w:rPr>
+          <w:rFonts w:ascii="Garamond" w:hAnsi="Garamond" w:cs="Garamond"/>
+          <w:color w:val="000000"/>
+          <w:lang w:val="tr-TR"/>
+        </w:rPr>
+        <w:t xml:space="preserve">Komutun uygulamadaki DURDUR düğmesinden mi </w:t>
+      </w:r>
+      <w:r>
+        <w:rPr>
+          <w:rFonts w:ascii="Garamond" w:hAnsi="Garamond" w:cs="Garamond"/>
+          <w:color w:val="000000"/>
+          <w:lang w:val="tr-TR"/>
+        </w:rPr>
+        <w:t>yoksa HW-584 IO Control ekranından mı verildiği bu mesajlarda açık değildir. Bu nedenle sonuç, uygulama düğmesinden başlayan tüm zincirin tamamlanmış kabul testi olarak değerlendirilmez.</w:t>
+      </w:r>
+    </w:p>
+    <w:p>
+      <w:pPr>
+        <w:pageBreakBefore/>
+        <w:spacing w:after="120" w:line="260" w:lineRule="auto"/>
+      </w:pPr>
+    </w:p>
+    <w:p>
+      <w:pPr>
+        <w:pStyle w:val="Balk1"/>
+        <w:spacing w:before="160" w:after="120" w:line="260" w:lineRule="auto"/>
+        <w:jc w:val="center"/>
+      </w:pPr>
+      <w:r>
+        <w:rPr>
+          <w:rFonts w:ascii="Garamond" w:hAnsi="Garamond" w:cs="Garamond"/>
+          <w:b/>
+          <w:color w:val="000000"/>
+          <w:sz w:val="28"/>
+          <w:u w:val="single"/>
+          <w:lang w:val="tr-TR"/>
+        </w:rPr>
+        <w:t>D4 Süreklilik testleri ve son değerlendirme</w:t>
+      </w:r>
+    </w:p>
+    <w:p>
+      <w:pPr>
+        <w:spacing w:after="120" w:line="360" w:lineRule="auto"/>
+      </w:pPr>
+      <w:r>
+        <w:rPr>
+          <w:rFonts w:ascii="Garamond" w:hAnsi="Garamond" w:cs="Garamond"/>
+          <w:color w:val="000000"/>
+          <w:lang w:val="tr-TR"/>
+        </w:rPr>
+        <w:t>Tekrar denemesinin başarısız olması üzerine röle kontağı ile uzun kablonun etkisi ayrı ayrı araştırıldı. Makine bağlantısından ayrılmış hat üzerinden süreklilik kontrolü tarif edildi. Yeni sonuçlar aşağıdaki kapsamda kaydedildi.</w:t>
+      </w:r>
+    </w:p>
+    <w:tbl>
+      <w:tblPr>
+        <w:tblStyle w:val="TableNormal"/>
+        <w:tblW w:w="9360" w:type="dxa"/>
+        <w:tblInd w:w="0" w:type="dxa"/>
+        <w:tblBorders>
+          <w:top w:val="single" w:sz="4" w:space="0" w:color="D9D9D9"/>
+          <w:left w:val="single" w:sz="4" w:space="0" w:color="D9D9D9"/>
+          <w:bottom w:val="single" w:sz="4" w:space="0" w:color="D9D9D9"/>
+          <w:right w:val="single" w:sz="4" w:space="0" w:color="D9D9D9"/>
+          <w:insideH w:val="single" w:sz="4" w:space="0" w:color="D9D9D9"/>
+          <w:insideV w:val="single" w:sz="4" w:space="0" w:color="D9D9D9"/>
+        </w:tblBorders>
+        <w:tblLayout w:type="fixed"/>
+        <w:tblCellMar>
+          <w:top w:w="90" w:type="dxa"/>
+          <w:left w:w="90" w:type="dxa"/>
+          <w:bottom w:w="90" w:type="dxa"/>
+          <w:right w:w="90" w:type="dxa"/>
+        </w:tblCellMar>
+        <w:tblLook w:val="04A0" w:firstRow="1" w:lastRow="0" w:firstColumn="1" w:lastColumn="0" w:noHBand="0" w:noVBand="1"/>
+      </w:tblPr>
+      <w:tblGrid>
+        <w:gridCol w:w="2600"/>
+        <w:gridCol w:w="2800"/>
+        <w:gridCol w:w="3960"/>
+      </w:tblGrid>
+      <w:tr>
+        <w:trPr>
+          <w:cantSplit/>
+          <w:tblHeader/>
+        </w:trPr>
+        <w:tc>
+          <w:tcPr>
+            <w:tcW w:w="2600" w:type="dxa"/>
+            <w:shd w:val="clear" w:color="auto" w:fill="E7E6E6"/>
+            <w:vAlign w:val="center"/>
+          </w:tcPr>
+          <w:p>
+            <w:pPr>
+              <w:spacing w:after="120" w:line="260" w:lineRule="auto"/>
+            </w:pPr>
+            <w:r>
+              <w:rPr>
+                <w:rFonts w:ascii="Garamond" w:hAnsi="Garamond" w:cs="Garamond"/>
+                <w:b/>
+                <w:color w:val="000000"/>
+                <w:sz w:val="22"/>
+                <w:lang w:val="tr-TR"/>
+              </w:rPr>
+              <w:t>Kontrol</w:t>
+            </w:r>
+          </w:p>
+        </w:tc>
+        <w:tc>
+          <w:tcPr>
+            <w:tcW w:w="2800" w:type="dxa"/>
+            <w:shd w:val="clear" w:color="auto" w:fill="E7E6E6"/>
+            <w:vAlign w:val="center"/>
+          </w:tcPr>
+          <w:p>
+            <w:pPr>
+              <w:spacing w:after="120" w:line="260" w:lineRule="auto"/>
+            </w:pPr>
+            <w:r>
+              <w:rPr>
+                <w:rFonts w:ascii="Garamond" w:hAnsi="Garamond" w:cs="Garamond"/>
+                <w:b/>
+                <w:color w:val="000000"/>
+                <w:sz w:val="22"/>
+                <w:lang w:val="tr-TR"/>
+              </w:rPr>
+              <w:t>Kullanıcı bildirimi</w:t>
+            </w:r>
+          </w:p>
+        </w:tc>
+        <w:tc>
+          <w:tcPr>
+            <w:tcW w:w="3960" w:type="dxa"/>
+            <w:shd w:val="clear" w:color="auto" w:fill="E7E6E6"/>
+            <w:vAlign w:val="center"/>
+          </w:tcPr>
+          <w:p>
+            <w:pPr>
+              <w:spacing w:after="120" w:line="260" w:lineRule="auto"/>
+            </w:pPr>
+            <w:r>
+              <w:rPr>
+                <w:rFonts w:ascii="Garamond" w:hAnsi="Garamond" w:cs="Garamond"/>
+                <w:b/>
+                <w:color w:val="000000"/>
+                <w:sz w:val="22"/>
+                <w:lang w:val="tr-TR"/>
+              </w:rPr>
+              <w:t>Sonuç kapsamı</w:t>
+            </w:r>
+          </w:p>
+        </w:tc>
+      </w:tr>
+      <w:tr>
+        <w:trPr>
+          <w:cantSplit/>
+        </w:trPr>
+        <w:tc>
+          <w:tcPr>
+            <w:tcW w:w="2600" w:type="dxa"/>
+            <w:shd w:val="clear" w:color="auto" w:fill="FFFFFF"/>
+            <w:vAlign w:val="center"/>
+          </w:tcPr>
+          <w:p>
+            <w:pPr>
+              <w:spacing w:after="120" w:line="260" w:lineRule="auto"/>
+            </w:pPr>
+            <w:r>
+              <w:rPr>
+                <w:rFonts w:ascii="Garamond" w:hAnsi="Garamond" w:cs="Garamond"/>
+                <w:color w:val="000000"/>
+                <w:sz w:val="22"/>
+                <w:lang w:val="tr-TR"/>
+              </w:rPr>
+              <w:t>Röle 1 COM–NC</w:t>
+            </w:r>
+          </w:p>
+        </w:tc>
+        <w:tc>
+          <w:tcPr>
+            <w:tcW w:w="2800" w:type="dxa"/>
+            <w:shd w:val="clear" w:color="auto" w:fill="FFFFFF"/>
+            <w:vAlign w:val="center"/>
+          </w:tcPr>
+          <w:p>
+            <w:pPr>
+              <w:spacing w:after="120" w:line="260" w:lineRule="auto"/>
+            </w:pPr>
+            <w:r>
+              <w:rPr>
+                <w:rFonts w:ascii="Garamond" w:hAnsi="Garamond" w:cs="Garamond"/>
+                <w:color w:val="000000"/>
+                <w:sz w:val="22"/>
+                <w:lang w:val="tr-TR"/>
+              </w:rPr>
+              <w:t>“Dediğin gibi oldu onken ötüyor”</w:t>
+            </w:r>
+          </w:p>
+        </w:tc>
+        <w:tc>
+          <w:tcPr>
+            <w:tcW w:w="3960" w:type="dxa"/>
+            <w:shd w:val="clear" w:color="auto" w:fill="FFFFFF"/>
+            <w:vAlign w:val="center"/>
+          </w:tcPr>
+          <w:p>
+            <w:pPr>
+              <w:spacing w:after="120" w:line="260" w:lineRule="auto"/>
+            </w:pPr>
+            <w:r>
+              <w:rPr>
+                <w:rFonts w:ascii="Garamond" w:hAnsi="Garamond" w:cs="Garamond"/>
+                <w:color w:val="000000"/>
+                <w:sz w:val="22"/>
+                <w:lang w:val="tr-TR"/>
+              </w:rPr>
+              <w:t>IO ON durumunda kontak sürekliliği açıkça doğrulandı. Röle ucundaki OFF sonucu ayrı yazılmadı.</w:t>
+            </w:r>
+          </w:p>
+        </w:tc>
+      </w:tr>
+      <w:tr>
+        <w:trPr>
+          <w:cantSplit/>
+        </w:trPr>
+        <w:tc>
+          <w:tcPr>
+            <w:tcW w:w="2600" w:type="dxa"/>
+            <w:shd w:val="clear" w:color="auto" w:fill="FFFFFF"/>
+            <w:vAlign w:val="center"/>
+          </w:tcPr>
+          <w:p>
+            <w:pPr>
+              <w:spacing w:after="120" w:line="260" w:lineRule="auto"/>
+            </w:pPr>
+            <w:r>
+              <w:rPr>
+                <w:rFonts w:ascii="Garamond" w:hAnsi="Garamond" w:cs="Garamond"/>
+                <w:color w:val="000000"/>
+                <w:sz w:val="22"/>
+                <w:lang w:val="tr-TR"/>
+              </w:rPr>
+              <w:t>Uzun kablonun makine tarafındaki iki ucu</w:t>
+            </w:r>
+          </w:p>
+        </w:tc>
+        <w:tc>
+          <w:tcPr>
+            <w:tcW w:w="2800" w:type="dxa"/>
+            <w:shd w:val="clear" w:color="auto" w:fill="FFFFFF"/>
+            <w:vAlign w:val="center"/>
+          </w:tcPr>
+          <w:p>
+            <w:pPr>
+              <w:spacing w:after="120" w:line="260" w:lineRule="auto"/>
+            </w:pPr>
+            <w:r>
+              <w:rPr>
+                <w:rFonts w:ascii="Garamond" w:hAnsi="Garamond" w:cs="Garamond"/>
+                <w:color w:val="000000"/>
+                <w:sz w:val="22"/>
+                <w:lang w:val="tr-TR"/>
+              </w:rPr>
+              <w:t>“Kablo uçları da dediğin gibi çalıştı”</w:t>
+            </w:r>
+          </w:p>
+        </w:tc>
+        <w:tc>
+          <w:tcPr>
+            <w:tcW w:w="3960" w:type="dxa"/>
+            <w:shd w:val="clear" w:color="auto" w:fill="FFFFFF"/>
+            <w:vAlign w:val="center"/>
+          </w:tcPr>
+          <w:p>
+            <w:pPr>
+              <w:spacing w:after="120" w:line="260" w:lineRule="auto"/>
+            </w:pPr>
+            <w:proofErr w:type="spellStart"/>
+            <w:r>
+              <w:rPr>
+                <w:rFonts w:ascii="Garamond" w:hAnsi="Garamond" w:cs="Garamond"/>
+                <w:color w:val="000000"/>
+                <w:sz w:val="22"/>
+                <w:lang w:val="tr-TR"/>
+              </w:rPr>
+              <w:t>ON’da</w:t>
+            </w:r>
+            <w:proofErr w:type="spellEnd"/>
+            <w:r>
+              <w:rPr>
+                <w:rFonts w:ascii="Garamond" w:hAnsi="Garamond" w:cs="Garamond"/>
+                <w:color w:val="000000"/>
+                <w:sz w:val="22"/>
+                <w:lang w:val="tr-TR"/>
+              </w:rPr>
+              <w:t xml:space="preserve"> ötme, </w:t>
+            </w:r>
+            <w:proofErr w:type="spellStart"/>
+            <w:r>
+              <w:rPr>
+                <w:rFonts w:ascii="Garamond" w:hAnsi="Garamond" w:cs="Garamond"/>
+                <w:color w:val="000000"/>
+                <w:sz w:val="22"/>
+                <w:lang w:val="tr-TR"/>
+              </w:rPr>
+              <w:t>OFF’ta</w:t>
+            </w:r>
+            <w:proofErr w:type="spellEnd"/>
+            <w:r>
+              <w:rPr>
+                <w:rFonts w:ascii="Garamond" w:hAnsi="Garamond" w:cs="Garamond"/>
+                <w:color w:val="000000"/>
+                <w:sz w:val="22"/>
+                <w:lang w:val="tr-TR"/>
+              </w:rPr>
+              <w:t xml:space="preserve"> ötmeme beklenen testine olumlu yanıt verildi.</w:t>
+            </w:r>
+          </w:p>
+        </w:tc>
+      </w:tr>
+      <w:tr>
+        <w:trPr>
+          <w:cantSplit/>
+        </w:trPr>
+        <w:tc>
+          <w:tcPr>
+            <w:tcW w:w="2600" w:type="dxa"/>
+            <w:shd w:val="clear" w:color="auto" w:fill="FFFFFF"/>
+            <w:vAlign w:val="center"/>
+          </w:tcPr>
+          <w:p>
+            <w:pPr>
+              <w:spacing w:after="120" w:line="260" w:lineRule="auto"/>
+            </w:pPr>
+            <w:r>
+              <w:rPr>
+                <w:rFonts w:ascii="Garamond" w:hAnsi="Garamond" w:cs="Garamond"/>
+                <w:color w:val="000000"/>
+                <w:sz w:val="22"/>
+                <w:lang w:val="tr-TR"/>
+              </w:rPr>
+              <w:t>Makineye bağlı uzun hat</w:t>
+            </w:r>
+          </w:p>
+        </w:tc>
+        <w:tc>
+          <w:tcPr>
+            <w:tcW w:w="2800" w:type="dxa"/>
+            <w:shd w:val="clear" w:color="auto" w:fill="FFFFFF"/>
+            <w:vAlign w:val="center"/>
+          </w:tcPr>
+          <w:p>
+            <w:pPr>
+              <w:spacing w:after="120" w:line="260" w:lineRule="auto"/>
+            </w:pPr>
+            <w:r>
+              <w:rPr>
+                <w:rFonts w:ascii="Garamond" w:hAnsi="Garamond" w:cs="Garamond"/>
+                <w:color w:val="000000"/>
+                <w:sz w:val="22"/>
+                <w:lang w:val="tr-TR"/>
+              </w:rPr>
+              <w:t>İlk denemede hata ve duruş; tekrarında hata oluşmadı</w:t>
+            </w:r>
+          </w:p>
+        </w:tc>
+        <w:tc>
+          <w:tcPr>
+            <w:tcW w:w="3960" w:type="dxa"/>
+            <w:shd w:val="clear" w:color="auto" w:fill="FFFFFF"/>
+            <w:vAlign w:val="center"/>
+          </w:tcPr>
+          <w:p>
+            <w:pPr>
+              <w:spacing w:after="120" w:line="260" w:lineRule="auto"/>
+            </w:pPr>
+            <w:r>
+              <w:rPr>
+                <w:rFonts w:ascii="Garamond" w:hAnsi="Garamond" w:cs="Garamond"/>
+                <w:color w:val="000000"/>
+                <w:sz w:val="22"/>
+                <w:lang w:val="tr-TR"/>
+              </w:rPr>
+              <w:t>Süreklilik testinin başarısına rağmen saha davranışı kararsız kaldı.</w:t>
+            </w:r>
+          </w:p>
+        </w:tc>
+      </w:tr>
+    </w:tbl>
+    <w:p>
+      <w:pPr>
+        <w:spacing w:after="120" w:line="260" w:lineRule="auto"/>
+      </w:pPr>
+    </w:p>
+    <w:p>
+      <w:pPr>
+        <w:spacing w:after="120" w:line="360" w:lineRule="auto"/>
+      </w:pPr>
+      <w:r>
+        <w:rPr>
+          <w:rFonts w:ascii="Garamond" w:hAnsi="Garamond" w:cs="Garamond"/>
+          <w:color w:val="000000"/>
+          <w:lang w:val="tr-TR"/>
+        </w:rPr>
+        <w:t>Bu testler, röle üzerinden uzun kablonun u</w:t>
+      </w:r>
+      <w:r>
+        <w:rPr>
+          <w:rFonts w:ascii="Garamond" w:hAnsi="Garamond" w:cs="Garamond"/>
+          <w:color w:val="000000"/>
+          <w:lang w:val="tr-TR"/>
+        </w:rPr>
+        <w:t>zak uçlarına kadar açma/kapama davranışının test anında iletildiğini destekliyor. Makinenin 2 ve 4 şeritleriyle son bağlantı noktaları başlıca şüpheli haline geldi. Ancak temas direnci, makineye bağlı çalışma koşulları ve tüm arıza olasılıkları bu sonuçlar</w:t>
+      </w:r>
+      <w:r>
+        <w:rPr>
+          <w:rFonts w:ascii="Garamond" w:hAnsi="Garamond" w:cs="Garamond"/>
+          <w:color w:val="000000"/>
+          <w:lang w:val="tr-TR"/>
+        </w:rPr>
+        <w:t>la kesin olarak elenmiş değildir.</w:t>
+      </w:r>
+    </w:p>
+    <w:p>
+      <w:pPr>
+        <w:pStyle w:val="Balk2"/>
+        <w:spacing w:after="120" w:line="260" w:lineRule="auto"/>
+      </w:pPr>
+      <w:r>
+        <w:rPr>
+          <w:rFonts w:ascii="Garamond" w:hAnsi="Garamond" w:cs="Garamond"/>
+          <w:b/>
+          <w:color w:val="000000"/>
+          <w:sz w:val="25"/>
+          <w:lang w:val="tr-TR"/>
+        </w:rPr>
+        <w:t>D5 Bağlantı uçlarının iyileştirilmesi</w:t>
+      </w:r>
+    </w:p>
+    <w:p>
+      <w:pPr>
+        <w:spacing w:after="120" w:line="360" w:lineRule="auto"/>
+      </w:pPr>
+      <w:r>
+        <w:rPr>
+          <w:rFonts w:ascii="Garamond" w:hAnsi="Garamond" w:cs="Garamond"/>
+          <w:color w:val="000000"/>
+          <w:lang w:val="tr-TR"/>
+        </w:rPr>
+        <w:t xml:space="preserve">Kablo uçlarının dağınık olması üzerine röle </w:t>
+      </w:r>
+      <w:proofErr w:type="spellStart"/>
+      <w:r>
+        <w:rPr>
+          <w:rFonts w:ascii="Garamond" w:hAnsi="Garamond" w:cs="Garamond"/>
+          <w:color w:val="000000"/>
+          <w:lang w:val="tr-TR"/>
+        </w:rPr>
+        <w:t>klemenslerinde</w:t>
+      </w:r>
+      <w:proofErr w:type="spellEnd"/>
+      <w:r>
+        <w:rPr>
+          <w:rFonts w:ascii="Garamond" w:hAnsi="Garamond" w:cs="Garamond"/>
+          <w:color w:val="000000"/>
+          <w:lang w:val="tr-TR"/>
+        </w:rPr>
+        <w:t xml:space="preserve"> 0,75 mm² kablo yüksüğü (</w:t>
+      </w:r>
+      <w:proofErr w:type="spellStart"/>
+      <w:r>
+        <w:rPr>
+          <w:rFonts w:ascii="Garamond" w:hAnsi="Garamond" w:cs="Garamond"/>
+          <w:color w:val="000000"/>
+          <w:lang w:val="tr-TR"/>
+        </w:rPr>
+        <w:t>ferrül</w:t>
+      </w:r>
+      <w:proofErr w:type="spellEnd"/>
+      <w:r>
+        <w:rPr>
+          <w:rFonts w:ascii="Garamond" w:hAnsi="Garamond" w:cs="Garamond"/>
+          <w:color w:val="000000"/>
+          <w:lang w:val="tr-TR"/>
+        </w:rPr>
+        <w:t>) kullanımı konuşuldu. Makine tarafında bantla bastırılmış temas yerine uygun soket, pabuç veya</w:t>
+      </w:r>
+      <w:r>
+        <w:rPr>
+          <w:rFonts w:ascii="Garamond" w:hAnsi="Garamond" w:cs="Garamond"/>
+          <w:color w:val="000000"/>
+          <w:lang w:val="tr-TR"/>
+        </w:rPr>
+        <w:t xml:space="preserve"> sıkıştırmalı bağlantı; geçici deneme için izoleli </w:t>
+      </w:r>
+      <w:proofErr w:type="spellStart"/>
+      <w:r>
+        <w:rPr>
+          <w:rFonts w:ascii="Garamond" w:hAnsi="Garamond" w:cs="Garamond"/>
+          <w:color w:val="000000"/>
+          <w:lang w:val="tr-TR"/>
+        </w:rPr>
+        <w:t>krokodil</w:t>
+      </w:r>
+      <w:proofErr w:type="spellEnd"/>
+      <w:r>
+        <w:rPr>
+          <w:rFonts w:ascii="Garamond" w:hAnsi="Garamond" w:cs="Garamond"/>
+          <w:color w:val="000000"/>
+          <w:lang w:val="tr-TR"/>
+        </w:rPr>
+        <w:t xml:space="preserve"> klips önerildi. Kabloya çekme yükü binmesini önleyecek sabitleme ve güç kablolarından ayrı güzergâh da ele alındı. Bunların uygulandığına dair son onay verilmedi.</w:t>
+      </w:r>
+    </w:p>
+    <w:p>
+      <w:pPr>
+        <w:spacing w:after="120" w:line="360" w:lineRule="auto"/>
+      </w:pPr>
+      <w:r>
+        <w:rPr>
+          <w:rFonts w:ascii="Garamond" w:hAnsi="Garamond" w:cs="Garamond"/>
+          <w:color w:val="000000"/>
+          <w:lang w:val="tr-TR"/>
+        </w:rPr>
+        <w:t>Son önerilen kontrol, her kablo d</w:t>
+      </w:r>
+      <w:r>
+        <w:rPr>
+          <w:rFonts w:ascii="Garamond" w:hAnsi="Garamond" w:cs="Garamond"/>
+          <w:color w:val="000000"/>
+          <w:lang w:val="tr-TR"/>
+        </w:rPr>
+        <w:t>amarı ile bağlı olduğu 2 veya 4 numaralı metal şerit arasındaki temasın ayrı ayrı doğrulanmasıydı. Ardından ON/OFF çevriminin makine üzerindeki hata davranışıyla birlikte yeniden denenmesi istendi. Bu son temas kontrolünün ve yeniden denemenin sonucu henüz</w:t>
+      </w:r>
+      <w:r>
+        <w:rPr>
+          <w:rFonts w:ascii="Garamond" w:hAnsi="Garamond" w:cs="Garamond"/>
+          <w:color w:val="000000"/>
+          <w:lang w:val="tr-TR"/>
+        </w:rPr>
+        <w:t xml:space="preserve"> kayıtlı değildir.</w:t>
+      </w:r>
+    </w:p>
+    <w:p>
+      <w:pPr>
+        <w:pStyle w:val="Balk2"/>
+        <w:spacing w:after="120" w:line="260" w:lineRule="auto"/>
+      </w:pPr>
+      <w:r>
+        <w:rPr>
+          <w:rFonts w:ascii="Garamond" w:hAnsi="Garamond" w:cs="Garamond"/>
+          <w:b/>
+          <w:color w:val="000000"/>
+          <w:sz w:val="25"/>
+          <w:lang w:val="tr-TR"/>
+        </w:rPr>
+        <w:lastRenderedPageBreak/>
+        <w:t>Güncel sonuç</w:t>
+      </w:r>
+    </w:p>
+    <w:p>
+      <w:pPr>
+        <w:spacing w:after="120" w:line="360" w:lineRule="auto"/>
+      </w:pPr>
+      <w:r>
+        <w:rPr>
+          <w:rFonts w:ascii="Garamond" w:hAnsi="Garamond" w:cs="Garamond"/>
+          <w:color w:val="000000"/>
+          <w:lang w:val="tr-TR"/>
+        </w:rPr>
+        <w:t>Gerçek makine bir denemede IO ON ile hata verip durdu. COM–NC ve uzun kablo üzerinden süreklilik değişimi de bildirildi. Proje, yalnızca bağlantı planı aşamasını geçti; mevcut açık konu tekrarlı denemelerde güvenilir temas ve kararlı çalışmadır. Önceki böl</w:t>
+      </w:r>
+      <w:r>
+        <w:rPr>
+          <w:rFonts w:ascii="Garamond" w:hAnsi="Garamond" w:cs="Garamond"/>
+          <w:color w:val="000000"/>
+          <w:lang w:val="tr-TR"/>
+        </w:rPr>
+        <w:t>ümlerdeki “gerçek duruş sonucu yok” ifadeleri kendi tarihlerinin kaydıdır; bu yeni duruş bildirimiyle güncellenmiştir.</w:t>
+      </w:r>
+    </w:p>
+    <w:p>
+      <w:pPr>
+        <w:spacing w:after="120" w:line="360" w:lineRule="auto"/>
+      </w:pPr>
+      <w:r>
+        <w:rPr>
+          <w:rFonts w:ascii="Garamond" w:hAnsi="Garamond" w:cs="Garamond"/>
+          <w:color w:val="000000"/>
+          <w:lang w:val="tr-TR"/>
+        </w:rPr>
+        <w:t xml:space="preserve">Tamamlanması beklenen yeni doğrulamalar: 2–4 uçlarında sağlam temasın belgelenmesi; art arda açma/kapama denemelerinde makine tepkisinin </w:t>
+      </w:r>
+      <w:r>
+        <w:rPr>
+          <w:rFonts w:ascii="Garamond" w:hAnsi="Garamond" w:cs="Garamond"/>
+          <w:color w:val="000000"/>
+          <w:lang w:val="tr-TR"/>
+        </w:rPr>
+        <w:t xml:space="preserve">kaydedilmesi; OFF sonrasında alarmın kalkması ve varsa </w:t>
+      </w:r>
+      <w:proofErr w:type="spellStart"/>
+      <w:r>
+        <w:rPr>
+          <w:rFonts w:ascii="Garamond" w:hAnsi="Garamond" w:cs="Garamond"/>
+          <w:color w:val="000000"/>
+          <w:lang w:val="tr-TR"/>
+        </w:rPr>
+        <w:t>reset</w:t>
+      </w:r>
+      <w:proofErr w:type="spellEnd"/>
+      <w:r>
+        <w:rPr>
+          <w:rFonts w:ascii="Garamond" w:hAnsi="Garamond" w:cs="Garamond"/>
+          <w:color w:val="000000"/>
+          <w:lang w:val="tr-TR"/>
+        </w:rPr>
+        <w:t xml:space="preserve"> gereksiniminin belirlenmesi; şirket ağı erişimindeki kesintinin açıklanması. Kablo uzunluğunun tek başarılı denemesi, uzun süreli saha uygunluğu olarak kabul edilmemiştir.</w:t>
+      </w:r>
+    </w:p>
+    <w:p>
+      <w:pPr>
+        <w:keepNext/>
+        <w:spacing w:after="120" w:line="260" w:lineRule="auto"/>
+      </w:pPr>
+      <w:r>
+        <w:rPr>
+          <w:rFonts w:ascii="Garamond" w:hAnsi="Garamond" w:cs="Garamond"/>
+          <w:b/>
+          <w:color w:val="000000"/>
+          <w:sz w:val="21"/>
+          <w:lang w:val="tr-TR"/>
+        </w:rPr>
+        <w:t xml:space="preserve">Kaynak: </w:t>
+      </w:r>
+      <w:proofErr w:type="spellStart"/>
+      <w:r>
+        <w:rPr>
+          <w:rFonts w:ascii="Garamond" w:hAnsi="Garamond" w:cs="Garamond"/>
+          <w:b/>
+          <w:color w:val="000000"/>
+          <w:sz w:val="21"/>
+          <w:lang w:val="tr-TR"/>
+        </w:rPr>
+        <w:t>ModbusProjesi</w:t>
+      </w:r>
+      <w:proofErr w:type="spellEnd"/>
+      <w:r>
+        <w:rPr>
+          <w:rFonts w:ascii="Garamond" w:hAnsi="Garamond" w:cs="Garamond"/>
+          <w:b/>
+          <w:color w:val="000000"/>
+          <w:sz w:val="21"/>
+          <w:lang w:val="tr-TR"/>
+        </w:rPr>
+        <w:t xml:space="preserve"> S</w:t>
+      </w:r>
+      <w:r>
+        <w:rPr>
+          <w:rFonts w:ascii="Garamond" w:hAnsi="Garamond" w:cs="Garamond"/>
+          <w:b/>
+          <w:color w:val="000000"/>
+          <w:sz w:val="21"/>
+          <w:lang w:val="tr-TR"/>
+        </w:rPr>
+        <w:t>aha konuşmasının 15 Eylül 2026 tarihli yeni mesajları; son kullanıcı sonucu “Kablo uçları da dediğin gibi çalıştı”.</w:t>
+      </w:r>
+    </w:p>
+    <w:p>
+      <w:pPr>
+        <w:pStyle w:val="Balk2"/>
+        <w:spacing w:after="120" w:line="260" w:lineRule="auto"/>
+      </w:pPr>
+      <w:r>
+        <w:rPr>
+          <w:rFonts w:ascii="Garamond" w:hAnsi="Garamond" w:cs="Garamond"/>
+          <w:b/>
+          <w:color w:val="000000"/>
+          <w:sz w:val="25"/>
+          <w:lang w:val="tr-TR"/>
+        </w:rPr>
+        <w:t>D6 Başarılı tamamlanma ve nihai sonuç</w:t>
+      </w:r>
+    </w:p>
+    <w:p>
+      <w:pPr>
+        <w:spacing w:after="120" w:line="360" w:lineRule="auto"/>
+      </w:pPr>
+      <w:r>
+        <w:rPr>
+          <w:rFonts w:ascii="Garamond" w:hAnsi="Garamond" w:cs="Garamond"/>
+          <w:color w:val="000000"/>
+          <w:lang w:val="tr-TR"/>
+        </w:rPr>
+        <w:t>Son saha denemesi sonucunda sistemin tamamının çalıştığı ve makineyi istenildiği gibi durdurduğu kulla</w:t>
+      </w:r>
+      <w:r>
+        <w:rPr>
+          <w:rFonts w:ascii="Garamond" w:hAnsi="Garamond" w:cs="Garamond"/>
+          <w:color w:val="000000"/>
+          <w:lang w:val="tr-TR"/>
+        </w:rPr>
+        <w:t>nıcı tarafından doğrulanmıştır. Böylece projenin temel hedefi olan, kurulan kontrol sistemi üzerinden gerçek makinenin durdurulması başarıyla gerçekleştirilmiştir.</w:t>
+      </w:r>
+    </w:p>
+    <w:p>
+      <w:pPr>
+        <w:spacing w:after="120" w:line="360" w:lineRule="auto"/>
+      </w:pPr>
+      <w:r>
+        <w:rPr>
+          <w:rFonts w:ascii="Garamond" w:hAnsi="Garamond" w:cs="Garamond"/>
+          <w:color w:val="000000"/>
+          <w:lang w:val="tr-TR"/>
+        </w:rPr>
+        <w:t>Önceki bölümlerde yer alan başarısız denemeler ve tamamlanma bekleyen duruş testleri, gelişt</w:t>
+      </w:r>
+      <w:r>
+        <w:rPr>
+          <w:rFonts w:ascii="Garamond" w:hAnsi="Garamond" w:cs="Garamond"/>
+          <w:color w:val="000000"/>
+          <w:lang w:val="tr-TR"/>
+        </w:rPr>
+        <w:t>irme sürecinin geçmiş kayıtlarıdır. Bu son doğrulama, makine durdurma işlevine ilişkin raporun nihai sonucudur.</w:t>
       </w:r>
     </w:p>
     <w:sectPr>
@@ -14950,7 +16748,7 @@
         <w:noProof/>
         <w:color w:val="000000"/>
       </w:rPr>
-      <w:t>2</w:t>
+      <w:t>1</w:t>
     </w:r>
     <w:r>
       <w:rPr>
@@ -15147,9 +16945,9 @@
 <file path=word/numbering.xml><?xml version="1.0" encoding="utf-8"?>
 <w:numbering xmlns:wpc="http://schemas.microsoft.com/office/word/2010/wordprocessingCanvas" xmlns:mc="http://schemas.openxmlformats.org/markup-compatibility/2006" xmlns:o="urn:schemas-microsoft-com:office:office" xmlns:r="http://schemas.openxmlformats.org/officeDocument/2006/relationships" xmlns:m="http://schemas.openxmlformats.org/officeDocument/2006/math" xmlns:v="urn:schemas-microsoft-com:vml" xmlns:wp14="http://schemas.microsoft.com/office/word/2010/wordprocessingDrawing" xmlns:wp="http://schemas.openxmlformats.org/drawingml/2006/wordprocessingDrawing" xmlns:w10="urn:schemas-microsoft-com:office:word" xmlns:w="http://schemas.openxmlformats.org/wordprocessingml/2006/main" xmlns:w14="http://schemas.microsoft.com/office/word/2010/wordml" xmlns:w15="http://schemas.microsoft.com/office/word/2012/wordml" xmlns:wpg="http://schemas.microsoft.com/office/word/2010/wordprocessingGroup" xmlns:wpi="http://schemas.microsoft.com/office/word/2010/wordprocessingInk" xmlns:wne="http://schemas.microsoft.com/office/word/2006/wordml" xmlns:wps="http://schemas.microsoft.com/office/word/2010/wordprocessingShape" mc:Ignorable="w14 w15 wp14">
   <w:abstractNum w:abstractNumId="0" w15:restartNumberingAfterBreak="0">
-    <w:nsid w:val="6C234E08"/>
+    <w:nsid w:val="28B96CAD"/>
     <w:multiLevelType w:val="multilevel"/>
-    <w:tmpl w:val="878EDAC8"/>
+    <w:tmpl w:val="C9C07586"/>
     <w:lvl w:ilvl="0">
       <w:start w:val="1"/>
       <w:numFmt w:val="decimal"/>

</xml_diff>